<commit_message>
Update ideas Word doc with ideas 7-9 and recommendation
</commit_message>
<xml_diff>
--- a/docs/ideas/CS3237_Group3_Project_Ideas.docx
+++ b/docs/ideas/CS3237_Group3_Project_Ideas.docx
@@ -37,7 +37,7 @@
         <w:rPr>
           <w:color w:val="595959"/>
         </w:rPr>
-        <w:t xml:space="preserve">Compiled by Shu Kai · 25 September 2026 · For discussion before the proposal deadline</w:t>
+        <w:t xml:space="preserve">Compiled by Shu Kai · Updated 26 September 2026 · For discussion before the proposal deadline</w:t>
       </w:r>
     </w:p>
     <w:p>
@@ -126,6 +126,7 @@
     <w:p>
       <w:pPr>
         <w:pStyle w:val="Heading2"/>
+        <w:keepNext/>
       </w:pPr>
       <w:r>
         <w:t xml:space="preserve">Must-haves from the project spec</w:t>
@@ -295,6 +296,7 @@
     <w:p>
       <w:pPr>
         <w:pStyle w:val="Heading2"/>
+        <w:keepNext/>
       </w:pPr>
       <w:r>
         <w:t xml:space="preserve">Timeline and grading</w:t>
@@ -407,6 +409,9 @@
         </w:tc>
       </w:tr>
       <w:tr>
+        <w:trPr>
+          <w:cantSplit/>
+        </w:trPr>
         <w:tc>
           <w:tcPr>
             <w:tcW w:type="dxa" w:w="2600"/>
@@ -480,6 +485,9 @@
         </w:tc>
       </w:tr>
       <w:tr>
+        <w:trPr>
+          <w:cantSplit/>
+        </w:trPr>
         <w:tc>
           <w:tcPr>
             <w:tcW w:type="dxa" w:w="2600"/>
@@ -553,6 +561,9 @@
         </w:tc>
       </w:tr>
       <w:tr>
+        <w:trPr>
+          <w:cantSplit/>
+        </w:trPr>
         <w:tc>
           <w:tcPr>
             <w:tcW w:type="dxa" w:w="2600"/>
@@ -626,6 +637,9 @@
         </w:tc>
       </w:tr>
       <w:tr>
+        <w:trPr>
+          <w:cantSplit/>
+        </w:trPr>
         <w:tc>
           <w:tcPr>
             <w:tcW w:type="dxa" w:w="2600"/>
@@ -699,6 +713,9 @@
         </w:tc>
       </w:tr>
       <w:tr>
+        <w:trPr>
+          <w:cantSplit/>
+        </w:trPr>
         <w:tc>
           <w:tcPr>
             <w:tcW w:type="dxa" w:w="2600"/>
@@ -772,6 +789,9 @@
         </w:tc>
       </w:tr>
       <w:tr>
+        <w:trPr>
+          <w:cantSplit/>
+        </w:trPr>
         <w:tc>
           <w:tcPr>
             <w:tcW w:type="dxa" w:w="2600"/>
@@ -879,6 +899,7 @@
     <w:p>
       <w:pPr>
         <w:pStyle w:val="Heading2"/>
+        <w:keepNext/>
       </w:pPr>
       <w:r>
         <w:t xml:space="preserve">Idea 1: Smart Clothing Drying Rack</w:t>
@@ -886,6 +907,7 @@
     </w:p>
     <w:p>
       <w:pPr>
+        <w:keepNext/>
         <w:spacing w:after="100"/>
       </w:pPr>
       <w:r>
@@ -978,6 +1000,9 @@
         </w:tc>
       </w:tr>
       <w:tr>
+        <w:trPr>
+          <w:cantSplit/>
+        </w:trPr>
         <w:tc>
           <w:tcPr>
             <w:tcW w:type="dxa" w:w="2400"/>
@@ -1029,6 +1054,9 @@
         </w:tc>
       </w:tr>
       <w:tr>
+        <w:trPr>
+          <w:cantSplit/>
+        </w:trPr>
         <w:tc>
           <w:tcPr>
             <w:tcW w:type="dxa" w:w="2400"/>
@@ -1080,6 +1108,9 @@
         </w:tc>
       </w:tr>
       <w:tr>
+        <w:trPr>
+          <w:cantSplit/>
+        </w:trPr>
         <w:tc>
           <w:tcPr>
             <w:tcW w:type="dxa" w:w="2400"/>
@@ -1131,6 +1162,9 @@
         </w:tc>
       </w:tr>
       <w:tr>
+        <w:trPr>
+          <w:cantSplit/>
+        </w:trPr>
         <w:tc>
           <w:tcPr>
             <w:tcW w:type="dxa" w:w="2400"/>
@@ -1182,6 +1216,9 @@
         </w:tc>
       </w:tr>
       <w:tr>
+        <w:trPr>
+          <w:cantSplit/>
+        </w:trPr>
         <w:tc>
           <w:tcPr>
             <w:tcW w:type="dxa" w:w="2400"/>
@@ -1233,6 +1270,9 @@
         </w:tc>
       </w:tr>
       <w:tr>
+        <w:trPr>
+          <w:cantSplit/>
+        </w:trPr>
         <w:tc>
           <w:tcPr>
             <w:tcW w:type="dxa" w:w="2400"/>
@@ -1284,6 +1324,9 @@
         </w:tc>
       </w:tr>
       <w:tr>
+        <w:trPr>
+          <w:cantSplit/>
+        </w:trPr>
         <w:tc>
           <w:tcPr>
             <w:tcW w:type="dxa" w:w="2400"/>
@@ -1390,6 +1433,7 @@
     <w:p>
       <w:pPr>
         <w:pStyle w:val="Heading2"/>
+        <w:keepNext/>
       </w:pPr>
       <w:r>
         <w:t xml:space="preserve">Idea 2: Smart Waste Bin with Fill-Level and Odour Prediction</w:t>
@@ -1397,6 +1441,7 @@
     </w:p>
     <w:p>
       <w:pPr>
+        <w:keepNext/>
         <w:spacing w:after="100"/>
       </w:pPr>
       <w:r>
@@ -1489,6 +1534,9 @@
         </w:tc>
       </w:tr>
       <w:tr>
+        <w:trPr>
+          <w:cantSplit/>
+        </w:trPr>
         <w:tc>
           <w:tcPr>
             <w:tcW w:type="dxa" w:w="2400"/>
@@ -1540,6 +1588,9 @@
         </w:tc>
       </w:tr>
       <w:tr>
+        <w:trPr>
+          <w:cantSplit/>
+        </w:trPr>
         <w:tc>
           <w:tcPr>
             <w:tcW w:type="dxa" w:w="2400"/>
@@ -1591,6 +1642,9 @@
         </w:tc>
       </w:tr>
       <w:tr>
+        <w:trPr>
+          <w:cantSplit/>
+        </w:trPr>
         <w:tc>
           <w:tcPr>
             <w:tcW w:type="dxa" w:w="2400"/>
@@ -1642,6 +1696,9 @@
         </w:tc>
       </w:tr>
       <w:tr>
+        <w:trPr>
+          <w:cantSplit/>
+        </w:trPr>
         <w:tc>
           <w:tcPr>
             <w:tcW w:type="dxa" w:w="2400"/>
@@ -1693,6 +1750,9 @@
         </w:tc>
       </w:tr>
       <w:tr>
+        <w:trPr>
+          <w:cantSplit/>
+        </w:trPr>
         <w:tc>
           <w:tcPr>
             <w:tcW w:type="dxa" w:w="2400"/>
@@ -1744,6 +1804,9 @@
         </w:tc>
       </w:tr>
       <w:tr>
+        <w:trPr>
+          <w:cantSplit/>
+        </w:trPr>
         <w:tc>
           <w:tcPr>
             <w:tcW w:type="dxa" w:w="2400"/>
@@ -1795,6 +1858,9 @@
         </w:tc>
       </w:tr>
       <w:tr>
+        <w:trPr>
+          <w:cantSplit/>
+        </w:trPr>
         <w:tc>
           <w:tcPr>
             <w:tcW w:type="dxa" w:w="2400"/>
@@ -1901,6 +1967,7 @@
     <w:p>
       <w:pPr>
         <w:pStyle w:val="Heading2"/>
+        <w:keepNext/>
       </w:pPr>
       <w:r>
         <w:t xml:space="preserve">Idea 3: Smart Dormitory Energy-Waste Detector</w:t>
@@ -1908,6 +1975,7 @@
     </w:p>
     <w:p>
       <w:pPr>
+        <w:keepNext/>
         <w:spacing w:after="100"/>
       </w:pPr>
       <w:r>
@@ -2000,6 +2068,9 @@
         </w:tc>
       </w:tr>
       <w:tr>
+        <w:trPr>
+          <w:cantSplit/>
+        </w:trPr>
         <w:tc>
           <w:tcPr>
             <w:tcW w:type="dxa" w:w="2400"/>
@@ -2051,6 +2122,9 @@
         </w:tc>
       </w:tr>
       <w:tr>
+        <w:trPr>
+          <w:cantSplit/>
+        </w:trPr>
         <w:tc>
           <w:tcPr>
             <w:tcW w:type="dxa" w:w="2400"/>
@@ -2102,6 +2176,9 @@
         </w:tc>
       </w:tr>
       <w:tr>
+        <w:trPr>
+          <w:cantSplit/>
+        </w:trPr>
         <w:tc>
           <w:tcPr>
             <w:tcW w:type="dxa" w:w="2400"/>
@@ -2153,6 +2230,9 @@
         </w:tc>
       </w:tr>
       <w:tr>
+        <w:trPr>
+          <w:cantSplit/>
+        </w:trPr>
         <w:tc>
           <w:tcPr>
             <w:tcW w:type="dxa" w:w="2400"/>
@@ -2204,6 +2284,9 @@
         </w:tc>
       </w:tr>
       <w:tr>
+        <w:trPr>
+          <w:cantSplit/>
+        </w:trPr>
         <w:tc>
           <w:tcPr>
             <w:tcW w:type="dxa" w:w="2400"/>
@@ -2255,6 +2338,9 @@
         </w:tc>
       </w:tr>
       <w:tr>
+        <w:trPr>
+          <w:cantSplit/>
+        </w:trPr>
         <w:tc>
           <w:tcPr>
             <w:tcW w:type="dxa" w:w="2400"/>
@@ -2361,6 +2447,7 @@
     <w:p>
       <w:pPr>
         <w:pStyle w:val="Heading2"/>
+        <w:keepNext/>
       </w:pPr>
       <w:r>
         <w:t xml:space="preserve">Idea 4: Smart AI Sorting Bin</w:t>
@@ -2368,6 +2455,7 @@
     </w:p>
     <w:p>
       <w:pPr>
+        <w:keepNext/>
         <w:spacing w:after="100"/>
       </w:pPr>
       <w:r>
@@ -2460,6 +2548,9 @@
         </w:tc>
       </w:tr>
       <w:tr>
+        <w:trPr>
+          <w:cantSplit/>
+        </w:trPr>
         <w:tc>
           <w:tcPr>
             <w:tcW w:type="dxa" w:w="2400"/>
@@ -2511,6 +2602,9 @@
         </w:tc>
       </w:tr>
       <w:tr>
+        <w:trPr>
+          <w:cantSplit/>
+        </w:trPr>
         <w:tc>
           <w:tcPr>
             <w:tcW w:type="dxa" w:w="2400"/>
@@ -2562,6 +2656,9 @@
         </w:tc>
       </w:tr>
       <w:tr>
+        <w:trPr>
+          <w:cantSplit/>
+        </w:trPr>
         <w:tc>
           <w:tcPr>
             <w:tcW w:type="dxa" w:w="2400"/>
@@ -2613,6 +2710,9 @@
         </w:tc>
       </w:tr>
       <w:tr>
+        <w:trPr>
+          <w:cantSplit/>
+        </w:trPr>
         <w:tc>
           <w:tcPr>
             <w:tcW w:type="dxa" w:w="2400"/>
@@ -2664,6 +2764,9 @@
         </w:tc>
       </w:tr>
       <w:tr>
+        <w:trPr>
+          <w:cantSplit/>
+        </w:trPr>
         <w:tc>
           <w:tcPr>
             <w:tcW w:type="dxa" w:w="2400"/>
@@ -2715,6 +2818,9 @@
         </w:tc>
       </w:tr>
       <w:tr>
+        <w:trPr>
+          <w:cantSplit/>
+        </w:trPr>
         <w:tc>
           <w:tcPr>
             <w:tcW w:type="dxa" w:w="2400"/>
@@ -2766,6 +2872,9 @@
         </w:tc>
       </w:tr>
       <w:tr>
+        <w:trPr>
+          <w:cantSplit/>
+        </w:trPr>
         <w:tc>
           <w:tcPr>
             <w:tcW w:type="dxa" w:w="2400"/>
@@ -2817,6 +2926,9 @@
         </w:tc>
       </w:tr>
       <w:tr>
+        <w:trPr>
+          <w:cantSplit/>
+        </w:trPr>
         <w:tc>
           <w:tcPr>
             <w:tcW w:type="dxa" w:w="2400"/>
@@ -2984,6 +3096,7 @@
     <w:p>
       <w:pPr>
         <w:pStyle w:val="Heading2"/>
+        <w:keepNext/>
       </w:pPr>
       <w:r>
         <w:t xml:space="preserve">Idea 5: Smart Fridge System</w:t>
@@ -2991,6 +3104,7 @@
     </w:p>
     <w:p>
       <w:pPr>
+        <w:keepNext/>
         <w:spacing w:after="100"/>
       </w:pPr>
       <w:r>
@@ -3083,6 +3197,9 @@
         </w:tc>
       </w:tr>
       <w:tr>
+        <w:trPr>
+          <w:cantSplit/>
+        </w:trPr>
         <w:tc>
           <w:tcPr>
             <w:tcW w:type="dxa" w:w="2400"/>
@@ -3134,6 +3251,9 @@
         </w:tc>
       </w:tr>
       <w:tr>
+        <w:trPr>
+          <w:cantSplit/>
+        </w:trPr>
         <w:tc>
           <w:tcPr>
             <w:tcW w:type="dxa" w:w="2400"/>
@@ -3185,6 +3305,9 @@
         </w:tc>
       </w:tr>
       <w:tr>
+        <w:trPr>
+          <w:cantSplit/>
+        </w:trPr>
         <w:tc>
           <w:tcPr>
             <w:tcW w:type="dxa" w:w="2400"/>
@@ -3236,6 +3359,9 @@
         </w:tc>
       </w:tr>
       <w:tr>
+        <w:trPr>
+          <w:cantSplit/>
+        </w:trPr>
         <w:tc>
           <w:tcPr>
             <w:tcW w:type="dxa" w:w="2400"/>
@@ -3287,6 +3413,9 @@
         </w:tc>
       </w:tr>
       <w:tr>
+        <w:trPr>
+          <w:cantSplit/>
+        </w:trPr>
         <w:tc>
           <w:tcPr>
             <w:tcW w:type="dxa" w:w="2400"/>
@@ -3338,6 +3467,9 @@
         </w:tc>
       </w:tr>
       <w:tr>
+        <w:trPr>
+          <w:cantSplit/>
+        </w:trPr>
         <w:tc>
           <w:tcPr>
             <w:tcW w:type="dxa" w:w="2400"/>
@@ -3389,6 +3521,9 @@
         </w:tc>
       </w:tr>
       <w:tr>
+        <w:trPr>
+          <w:cantSplit/>
+        </w:trPr>
         <w:tc>
           <w:tcPr>
             <w:tcW w:type="dxa" w:w="2400"/>
@@ -3440,6 +3575,9 @@
         </w:tc>
       </w:tr>
       <w:tr>
+        <w:trPr>
+          <w:cantSplit/>
+        </w:trPr>
         <w:tc>
           <w:tcPr>
             <w:tcW w:type="dxa" w:w="2400"/>
@@ -3546,6 +3684,7 @@
     <w:p>
       <w:pPr>
         <w:pStyle w:val="Heading2"/>
+        <w:keepNext/>
       </w:pPr>
       <w:r>
         <w:t xml:space="preserve">Idea 6: Smart Wireless Interference Detection System</w:t>
@@ -3553,6 +3692,7 @@
     </w:p>
     <w:p>
       <w:pPr>
+        <w:keepNext/>
         <w:spacing w:after="100"/>
       </w:pPr>
       <w:r>
@@ -3645,6 +3785,9 @@
         </w:tc>
       </w:tr>
       <w:tr>
+        <w:trPr>
+          <w:cantSplit/>
+        </w:trPr>
         <w:tc>
           <w:tcPr>
             <w:tcW w:type="dxa" w:w="2400"/>
@@ -3696,6 +3839,9 @@
         </w:tc>
       </w:tr>
       <w:tr>
+        <w:trPr>
+          <w:cantSplit/>
+        </w:trPr>
         <w:tc>
           <w:tcPr>
             <w:tcW w:type="dxa" w:w="2400"/>
@@ -3747,6 +3893,9 @@
         </w:tc>
       </w:tr>
       <w:tr>
+        <w:trPr>
+          <w:cantSplit/>
+        </w:trPr>
         <w:tc>
           <w:tcPr>
             <w:tcW w:type="dxa" w:w="2400"/>
@@ -3798,6 +3947,9 @@
         </w:tc>
       </w:tr>
       <w:tr>
+        <w:trPr>
+          <w:cantSplit/>
+        </w:trPr>
         <w:tc>
           <w:tcPr>
             <w:tcW w:type="dxa" w:w="2400"/>
@@ -3849,6 +4001,9 @@
         </w:tc>
       </w:tr>
       <w:tr>
+        <w:trPr>
+          <w:cantSplit/>
+        </w:trPr>
         <w:tc>
           <w:tcPr>
             <w:tcW w:type="dxa" w:w="2400"/>
@@ -3900,6 +4055,9 @@
         </w:tc>
       </w:tr>
       <w:tr>
+        <w:trPr>
+          <w:cantSplit/>
+        </w:trPr>
         <w:tc>
           <w:tcPr>
             <w:tcW w:type="dxa" w:w="2400"/>
@@ -3951,6 +4109,9 @@
         </w:tc>
       </w:tr>
       <w:tr>
+        <w:trPr>
+          <w:cantSplit/>
+        </w:trPr>
         <w:tc>
           <w:tcPr>
             <w:tcW w:type="dxa" w:w="2400"/>
@@ -4060,6 +4221,1699 @@
       </w:pPr>
       <w:r>
         <w:t xml:space="preserve">Few natural actuators; the edge action is mainly an alert.</w:t>
+      </w:r>
+    </w:p>
+    <w:p>
+      <w:pPr>
+        <w:spacing w:after="60"/>
+      </w:pPr>
+    </w:p>
+    <w:p>
+      <w:pPr>
+        <w:pStyle w:val="Heading2"/>
+        <w:keepNext/>
+      </w:pPr>
+      <w:r>
+        <w:t xml:space="preserve">Idea 7: Predictive Maintenance for Motors and Fans</w:t>
+      </w:r>
+    </w:p>
+    <w:p>
+      <w:pPr>
+        <w:keepNext/>
+        <w:spacing w:after="100"/>
+      </w:pPr>
+      <w:r>
+        <w:rPr>
+          <w:b/>
+          <w:bCs/>
+          <w:color w:val="C55A11"/>
+        </w:rPr>
+        <w:t xml:space="preserve">NEW  </w:t>
+      </w:r>
+      <w:r>
+        <w:rPr>
+          <w:i/>
+          <w:iCs/>
+          <w:color w:val="595959"/>
+        </w:rPr>
+        <w:t xml:space="preserve">Proposed by Claude (new suggestion). </w:t>
+      </w:r>
+      <w:r>
+        <w:t xml:space="preserve">Monitors a motor or fan for abnormal vibration, heat and current draw, shuts it down instantly when something dangerous happens, and learns its wear pattern over time. This is an Industrial IoT use case.</w:t>
+      </w:r>
+    </w:p>
+    <w:tbl>
+      <w:tblPr>
+        <w:tblW w:type="dxa" w:w="9026"/>
+        <w:tblBorders>
+          <w:top w:val="single" w:color="auto" w:sz="4"/>
+          <w:left w:val="single" w:color="auto" w:sz="4"/>
+          <w:bottom w:val="single" w:color="auto" w:sz="4"/>
+          <w:right w:val="single" w:color="auto" w:sz="4"/>
+          <w:insideH w:val="single" w:color="auto" w:sz="4"/>
+          <w:insideV w:val="single" w:color="auto" w:sz="4"/>
+        </w:tblBorders>
+      </w:tblPr>
+      <w:tblGrid>
+        <w:gridCol w:w="2400"/>
+        <w:gridCol w:w="6626"/>
+      </w:tblGrid>
+      <w:tr>
+        <w:trPr>
+          <w:tblHeader/>
+        </w:trPr>
+        <w:tc>
+          <w:tcPr>
+            <w:tcW w:type="dxa" w:w="2400"/>
+            <w:tcBorders>
+              <w:top w:val="single" w:color="BFBFBF" w:sz="4"/>
+              <w:left w:val="single" w:color="BFBFBF" w:sz="4"/>
+              <w:bottom w:val="single" w:color="BFBFBF" w:sz="4"/>
+              <w:right w:val="single" w:color="BFBFBF" w:sz="4"/>
+            </w:tcBorders>
+            <w:shd w:fill="1F4E79" w:color="auto" w:val="clear"/>
+            <w:tcMar>
+              <w:top w:type="dxa" w:w="60"/>
+              <w:left w:type="dxa" w:w="100"/>
+              <w:bottom w:type="dxa" w:w="60"/>
+              <w:right w:type="dxa" w:w="100"/>
+            </w:tcMar>
+          </w:tcPr>
+          <w:p>
+            <w:r>
+              <w:rPr>
+                <w:b/>
+                <w:bCs/>
+                <w:color w:val="FFFFFF"/>
+              </w:rPr>
+              <w:t xml:space="preserve">Component</w:t>
+            </w:r>
+          </w:p>
+        </w:tc>
+        <w:tc>
+          <w:tcPr>
+            <w:tcW w:type="dxa" w:w="6626"/>
+            <w:tcBorders>
+              <w:top w:val="single" w:color="BFBFBF" w:sz="4"/>
+              <w:left w:val="single" w:color="BFBFBF" w:sz="4"/>
+              <w:bottom w:val="single" w:color="BFBFBF" w:sz="4"/>
+              <w:right w:val="single" w:color="BFBFBF" w:sz="4"/>
+            </w:tcBorders>
+            <w:shd w:fill="1F4E79" w:color="auto" w:val="clear"/>
+            <w:tcMar>
+              <w:top w:type="dxa" w:w="60"/>
+              <w:left w:type="dxa" w:w="100"/>
+              <w:bottom w:type="dxa" w:w="60"/>
+              <w:right w:type="dxa" w:w="100"/>
+            </w:tcMar>
+          </w:tcPr>
+          <w:p>
+            <w:r>
+              <w:rPr>
+                <w:b/>
+                <w:bCs/>
+                <w:color w:val="FFFFFF"/>
+              </w:rPr>
+              <w:t xml:space="preserve">Details</w:t>
+            </w:r>
+          </w:p>
+        </w:tc>
+      </w:tr>
+      <w:tr>
+        <w:trPr>
+          <w:cantSplit/>
+        </w:trPr>
+        <w:tc>
+          <w:tcPr>
+            <w:tcW w:type="dxa" w:w="2400"/>
+            <w:tcBorders>
+              <w:top w:val="single" w:color="BFBFBF" w:sz="4"/>
+              <w:left w:val="single" w:color="BFBFBF" w:sz="4"/>
+              <w:bottom w:val="single" w:color="BFBFBF" w:sz="4"/>
+              <w:right w:val="single" w:color="BFBFBF" w:sz="4"/>
+            </w:tcBorders>
+            <w:shd w:fill="DCE6F1" w:color="auto" w:val="clear"/>
+            <w:tcMar>
+              <w:top w:type="dxa" w:w="60"/>
+              <w:left w:type="dxa" w:w="100"/>
+              <w:bottom w:type="dxa" w:w="60"/>
+              <w:right w:type="dxa" w:w="100"/>
+            </w:tcMar>
+          </w:tcPr>
+          <w:p>
+            <w:r>
+              <w:rPr>
+                <w:b/>
+                <w:bCs/>
+              </w:rPr>
+              <w:t xml:space="preserve">ESP32 #1</w:t>
+            </w:r>
+          </w:p>
+        </w:tc>
+        <w:tc>
+          <w:tcPr>
+            <w:tcW w:type="dxa" w:w="6626"/>
+            <w:tcBorders>
+              <w:top w:val="single" w:color="BFBFBF" w:sz="4"/>
+              <w:left w:val="single" w:color="BFBFBF" w:sz="4"/>
+              <w:bottom w:val="single" w:color="BFBFBF" w:sz="4"/>
+              <w:right w:val="single" w:color="BFBFBF" w:sz="4"/>
+            </w:tcBorders>
+            <w:tcMar>
+              <w:top w:type="dxa" w:w="60"/>
+              <w:left w:type="dxa" w:w="100"/>
+              <w:bottom w:type="dxa" w:w="60"/>
+              <w:right w:type="dxa" w:w="100"/>
+            </w:tcMar>
+          </w:tcPr>
+          <w:p>
+            <w:r>
+              <w:t xml:space="preserve">IMU / accelerometer (vibration) + temperature sensor clipped onto the fan or motor housing</w:t>
+            </w:r>
+          </w:p>
+        </w:tc>
+      </w:tr>
+      <w:tr>
+        <w:trPr>
+          <w:cantSplit/>
+        </w:trPr>
+        <w:tc>
+          <w:tcPr>
+            <w:tcW w:type="dxa" w:w="2400"/>
+            <w:tcBorders>
+              <w:top w:val="single" w:color="BFBFBF" w:sz="4"/>
+              <w:left w:val="single" w:color="BFBFBF" w:sz="4"/>
+              <w:bottom w:val="single" w:color="BFBFBF" w:sz="4"/>
+              <w:right w:val="single" w:color="BFBFBF" w:sz="4"/>
+            </w:tcBorders>
+            <w:shd w:fill="DCE6F1" w:color="auto" w:val="clear"/>
+            <w:tcMar>
+              <w:top w:type="dxa" w:w="60"/>
+              <w:left w:type="dxa" w:w="100"/>
+              <w:bottom w:type="dxa" w:w="60"/>
+              <w:right w:type="dxa" w:w="100"/>
+            </w:tcMar>
+          </w:tcPr>
+          <w:p>
+            <w:r>
+              <w:rPr>
+                <w:b/>
+                <w:bCs/>
+              </w:rPr>
+              <w:t xml:space="preserve">ESP32 #2</w:t>
+            </w:r>
+          </w:p>
+        </w:tc>
+        <w:tc>
+          <w:tcPr>
+            <w:tcW w:type="dxa" w:w="6626"/>
+            <w:tcBorders>
+              <w:top w:val="single" w:color="BFBFBF" w:sz="4"/>
+              <w:left w:val="single" w:color="BFBFBF" w:sz="4"/>
+              <w:bottom w:val="single" w:color="BFBFBF" w:sz="4"/>
+              <w:right w:val="single" w:color="BFBFBF" w:sz="4"/>
+            </w:tcBorders>
+            <w:tcMar>
+              <w:top w:type="dxa" w:w="60"/>
+              <w:left w:type="dxa" w:w="100"/>
+              <w:bottom w:type="dxa" w:w="60"/>
+              <w:right w:type="dxa" w:w="100"/>
+            </w:tcMar>
+          </w:tcPr>
+          <w:p>
+            <w:r>
+              <w:t xml:space="preserve">Current sensor on the fan supply + relay to cut power; optional microphone for acoustic signature</w:t>
+            </w:r>
+          </w:p>
+        </w:tc>
+      </w:tr>
+      <w:tr>
+        <w:trPr>
+          <w:cantSplit/>
+        </w:trPr>
+        <w:tc>
+          <w:tcPr>
+            <w:tcW w:type="dxa" w:w="2400"/>
+            <w:tcBorders>
+              <w:top w:val="single" w:color="BFBFBF" w:sz="4"/>
+              <w:left w:val="single" w:color="BFBFBF" w:sz="4"/>
+              <w:bottom w:val="single" w:color="BFBFBF" w:sz="4"/>
+              <w:right w:val="single" w:color="BFBFBF" w:sz="4"/>
+            </w:tcBorders>
+            <w:shd w:fill="DCE6F1" w:color="auto" w:val="clear"/>
+            <w:tcMar>
+              <w:top w:type="dxa" w:w="60"/>
+              <w:left w:type="dxa" w:w="100"/>
+              <w:bottom w:type="dxa" w:w="60"/>
+              <w:right w:type="dxa" w:w="100"/>
+            </w:tcMar>
+          </w:tcPr>
+          <w:p>
+            <w:r>
+              <w:rPr>
+                <w:b/>
+                <w:bCs/>
+              </w:rPr>
+              <w:t xml:space="preserve">Edge action (real-time)</w:t>
+            </w:r>
+          </w:p>
+        </w:tc>
+        <w:tc>
+          <w:tcPr>
+            <w:tcW w:type="dxa" w:w="6626"/>
+            <w:tcBorders>
+              <w:top w:val="single" w:color="BFBFBF" w:sz="4"/>
+              <w:left w:val="single" w:color="BFBFBF" w:sz="4"/>
+              <w:bottom w:val="single" w:color="BFBFBF" w:sz="4"/>
+              <w:right w:val="single" w:color="BFBFBF" w:sz="4"/>
+            </w:tcBorders>
+            <w:tcMar>
+              <w:top w:type="dxa" w:w="60"/>
+              <w:left w:type="dxa" w:w="100"/>
+              <w:bottom w:type="dxa" w:w="60"/>
+              <w:right w:type="dxa" w:w="100"/>
+            </w:tcMar>
+          </w:tcPr>
+          <w:p>
+            <w:r>
+              <w:t xml:space="preserve">Vibration or temperature crosses a danger threshold → relay cuts power within milliseconds, buzzer/LED alert</w:t>
+            </w:r>
+          </w:p>
+        </w:tc>
+      </w:tr>
+      <w:tr>
+        <w:trPr>
+          <w:cantSplit/>
+        </w:trPr>
+        <w:tc>
+          <w:tcPr>
+            <w:tcW w:type="dxa" w:w="2400"/>
+            <w:tcBorders>
+              <w:top w:val="single" w:color="BFBFBF" w:sz="4"/>
+              <w:left w:val="single" w:color="BFBFBF" w:sz="4"/>
+              <w:bottom w:val="single" w:color="BFBFBF" w:sz="4"/>
+              <w:right w:val="single" w:color="BFBFBF" w:sz="4"/>
+            </w:tcBorders>
+            <w:shd w:fill="DCE6F1" w:color="auto" w:val="clear"/>
+            <w:tcMar>
+              <w:top w:type="dxa" w:w="60"/>
+              <w:left w:type="dxa" w:w="100"/>
+              <w:bottom w:type="dxa" w:w="60"/>
+              <w:right w:type="dxa" w:w="100"/>
+            </w:tcMar>
+          </w:tcPr>
+          <w:p>
+            <w:r>
+              <w:rPr>
+                <w:b/>
+                <w:bCs/>
+              </w:rPr>
+              <w:t xml:space="preserve">Actuator</w:t>
+            </w:r>
+          </w:p>
+        </w:tc>
+        <w:tc>
+          <w:tcPr>
+            <w:tcW w:type="dxa" w:w="6626"/>
+            <w:tcBorders>
+              <w:top w:val="single" w:color="BFBFBF" w:sz="4"/>
+              <w:left w:val="single" w:color="BFBFBF" w:sz="4"/>
+              <w:bottom w:val="single" w:color="BFBFBF" w:sz="4"/>
+              <w:right w:val="single" w:color="BFBFBF" w:sz="4"/>
+            </w:tcBorders>
+            <w:tcMar>
+              <w:top w:type="dxa" w:w="60"/>
+              <w:left w:type="dxa" w:w="100"/>
+              <w:bottom w:type="dxa" w:w="60"/>
+              <w:right w:type="dxa" w:w="100"/>
+            </w:tcMar>
+          </w:tcPr>
+          <w:p>
+            <w:r>
+              <w:t xml:space="preserve">Relay (power cut-off); optional fan-speed control</w:t>
+            </w:r>
+          </w:p>
+        </w:tc>
+      </w:tr>
+      <w:tr>
+        <w:trPr>
+          <w:cantSplit/>
+        </w:trPr>
+        <w:tc>
+          <w:tcPr>
+            <w:tcW w:type="dxa" w:w="2400"/>
+            <w:tcBorders>
+              <w:top w:val="single" w:color="BFBFBF" w:sz="4"/>
+              <w:left w:val="single" w:color="BFBFBF" w:sz="4"/>
+              <w:bottom w:val="single" w:color="BFBFBF" w:sz="4"/>
+              <w:right w:val="single" w:color="BFBFBF" w:sz="4"/>
+            </w:tcBorders>
+            <w:shd w:fill="DCE6F1" w:color="auto" w:val="clear"/>
+            <w:tcMar>
+              <w:top w:type="dxa" w:w="60"/>
+              <w:left w:type="dxa" w:w="100"/>
+              <w:bottom w:type="dxa" w:w="60"/>
+              <w:right w:type="dxa" w:w="100"/>
+            </w:tcMar>
+          </w:tcPr>
+          <w:p>
+            <w:r>
+              <w:rPr>
+                <w:b/>
+                <w:bCs/>
+              </w:rPr>
+              <w:t xml:space="preserve">ML</w:t>
+            </w:r>
+          </w:p>
+        </w:tc>
+        <w:tc>
+          <w:tcPr>
+            <w:tcW w:type="dxa" w:w="6626"/>
+            <w:tcBorders>
+              <w:top w:val="single" w:color="BFBFBF" w:sz="4"/>
+              <w:left w:val="single" w:color="BFBFBF" w:sz="4"/>
+              <w:bottom w:val="single" w:color="BFBFBF" w:sz="4"/>
+              <w:right w:val="single" w:color="BFBFBF" w:sz="4"/>
+            </w:tcBorders>
+            <w:tcMar>
+              <w:top w:type="dxa" w:w="60"/>
+              <w:left w:type="dxa" w:w="100"/>
+              <w:bottom w:type="dxa" w:w="60"/>
+              <w:right w:type="dxa" w:w="100"/>
+            </w:tcMar>
+          </w:tcPr>
+          <w:p>
+            <w:r>
+              <w:t xml:space="preserve">Autoencoder trained on "healthy" data → anomaly score; FFT features + SVM/NN to classify fault type (imbalance, obstruction, loose mount)</w:t>
+            </w:r>
+          </w:p>
+        </w:tc>
+      </w:tr>
+      <w:tr>
+        <w:trPr>
+          <w:cantSplit/>
+        </w:trPr>
+        <w:tc>
+          <w:tcPr>
+            <w:tcW w:type="dxa" w:w="2400"/>
+            <w:tcBorders>
+              <w:top w:val="single" w:color="BFBFBF" w:sz="4"/>
+              <w:left w:val="single" w:color="BFBFBF" w:sz="4"/>
+              <w:bottom w:val="single" w:color="BFBFBF" w:sz="4"/>
+              <w:right w:val="single" w:color="BFBFBF" w:sz="4"/>
+            </w:tcBorders>
+            <w:shd w:fill="DCE6F1" w:color="auto" w:val="clear"/>
+            <w:tcMar>
+              <w:top w:type="dxa" w:w="60"/>
+              <w:left w:type="dxa" w:w="100"/>
+              <w:bottom w:type="dxa" w:w="60"/>
+              <w:right w:type="dxa" w:w="100"/>
+            </w:tcMar>
+          </w:tcPr>
+          <w:p>
+            <w:r>
+              <w:rPr>
+                <w:b/>
+                <w:bCs/>
+              </w:rPr>
+              <w:t xml:space="preserve">Cloud (long-term)</w:t>
+            </w:r>
+          </w:p>
+        </w:tc>
+        <w:tc>
+          <w:tcPr>
+            <w:tcW w:type="dxa" w:w="6626"/>
+            <w:tcBorders>
+              <w:top w:val="single" w:color="BFBFBF" w:sz="4"/>
+              <w:left w:val="single" w:color="BFBFBF" w:sz="4"/>
+              <w:bottom w:val="single" w:color="BFBFBF" w:sz="4"/>
+              <w:right w:val="single" w:color="BFBFBF" w:sz="4"/>
+            </w:tcBorders>
+            <w:tcMar>
+              <w:top w:type="dxa" w:w="60"/>
+              <w:left w:type="dxa" w:w="100"/>
+              <w:bottom w:type="dxa" w:w="60"/>
+              <w:right w:type="dxa" w:w="100"/>
+            </w:tcMar>
+          </w:tcPr>
+          <w:p>
+            <w:r>
+              <w:t xml:space="preserve">Anomaly score trend, wear over time, estimated time until maintenance, fault log</w:t>
+            </w:r>
+          </w:p>
+        </w:tc>
+      </w:tr>
+      <w:tr>
+        <w:trPr>
+          <w:cantSplit/>
+        </w:trPr>
+        <w:tc>
+          <w:tcPr>
+            <w:tcW w:type="dxa" w:w="2400"/>
+            <w:tcBorders>
+              <w:top w:val="single" w:color="BFBFBF" w:sz="4"/>
+              <w:left w:val="single" w:color="BFBFBF" w:sz="4"/>
+              <w:bottom w:val="single" w:color="BFBFBF" w:sz="4"/>
+              <w:right w:val="single" w:color="BFBFBF" w:sz="4"/>
+            </w:tcBorders>
+            <w:shd w:fill="DCE6F1" w:color="auto" w:val="clear"/>
+            <w:tcMar>
+              <w:top w:type="dxa" w:w="60"/>
+              <w:left w:type="dxa" w:w="100"/>
+              <w:bottom w:type="dxa" w:w="60"/>
+              <w:right w:type="dxa" w:w="100"/>
+            </w:tcMar>
+          </w:tcPr>
+          <w:p>
+            <w:r>
+              <w:rPr>
+                <w:b/>
+                <w:bCs/>
+              </w:rPr>
+              <w:t xml:space="preserve">Demo</w:t>
+            </w:r>
+          </w:p>
+        </w:tc>
+        <w:tc>
+          <w:tcPr>
+            <w:tcW w:type="dxa" w:w="6626"/>
+            <w:tcBorders>
+              <w:top w:val="single" w:color="BFBFBF" w:sz="4"/>
+              <w:left w:val="single" w:color="BFBFBF" w:sz="4"/>
+              <w:bottom w:val="single" w:color="BFBFBF" w:sz="4"/>
+              <w:right w:val="single" w:color="BFBFBF" w:sz="4"/>
+            </w:tcBorders>
+            <w:tcMar>
+              <w:top w:type="dxa" w:w="60"/>
+              <w:left w:type="dxa" w:w="100"/>
+              <w:bottom w:type="dxa" w:w="60"/>
+              <w:right w:type="dxa" w:w="100"/>
+            </w:tcMar>
+          </w:tcPr>
+          <w:p>
+            <w:r>
+              <w:t xml:space="preserve">Run a small USB/desk fan normally, then tape a coin to one blade or lightly obstruct it; the system detects it and cuts power live</w:t>
+            </w:r>
+          </w:p>
+        </w:tc>
+      </w:tr>
+    </w:tbl>
+    <w:p>
+      <w:pPr>
+        <w:pStyle w:val="Heading3"/>
+      </w:pPr>
+      <w:r>
+        <w:t xml:space="preserve">Notes against the brief</w:t>
+      </w:r>
+    </w:p>
+    <w:p>
+      <w:pPr>
+        <w:pStyle w:val="ListParagraph"/>
+        <w:numPr>
+          <w:ilvl w:val="0"/>
+          <w:numId w:val="2"/>
+        </w:numPr>
+        <w:spacing w:after="60"/>
+      </w:pPr>
+      <w:r>
+        <w:t xml:space="preserve">Industrial IoT is a syllabus topic, and autoencoders/SVMs are covered in lectures.</w:t>
+      </w:r>
+    </w:p>
+    <w:p>
+      <w:pPr>
+        <w:pStyle w:val="ListParagraph"/>
+        <w:numPr>
+          <w:ilvl w:val="0"/>
+          <w:numId w:val="2"/>
+        </w:numPr>
+        <w:spacing w:after="60"/>
+      </w:pPr>
+      <w:r>
+        <w:t xml:space="preserve">Clear edge/cloud split, and data is fast to collect (hours of labelled vibration data in a day). Not on the past-projects list.</w:t>
+      </w:r>
+    </w:p>
+    <w:p>
+      <w:pPr>
+        <w:pStyle w:val="ListParagraph"/>
+        <w:numPr>
+          <w:ilvl w:val="0"/>
+          <w:numId w:val="2"/>
+        </w:numPr>
+        <w:spacing w:after="60"/>
+      </w:pPr>
+      <w:r>
+        <w:t xml:space="preserve">Use a low-voltage (USB/12 V) fan, not a mains appliance, for the relay.</w:t>
+      </w:r>
+    </w:p>
+    <w:p>
+      <w:pPr>
+        <w:pStyle w:val="ListParagraph"/>
+        <w:numPr>
+          <w:ilvl w:val="0"/>
+          <w:numId w:val="2"/>
+        </w:numPr>
+        <w:spacing w:after="60"/>
+      </w:pPr>
+      <w:r>
+        <w:t xml:space="preserve">Running the FFT on the ESP32 and sending only features is good power-analysis material; FreeRTOS tasks and a 3D-printed sensor mount can earn bonus points.</w:t>
+      </w:r>
+    </w:p>
+    <w:p>
+      <w:pPr>
+        <w:spacing w:after="60"/>
+      </w:pPr>
+    </w:p>
+    <w:p>
+      <w:pPr>
+        <w:pStyle w:val="Heading2"/>
+        <w:keepNext/>
+      </w:pPr>
+      <w:r>
+        <w:t xml:space="preserve">Idea 8: Dengue Breeding-Site Monitor</w:t>
+      </w:r>
+    </w:p>
+    <w:p>
+      <w:pPr>
+        <w:keepNext/>
+        <w:spacing w:after="100"/>
+      </w:pPr>
+      <w:r>
+        <w:rPr>
+          <w:b/>
+          <w:bCs/>
+          <w:color w:val="C55A11"/>
+        </w:rPr>
+        <w:t xml:space="preserve">NEW  </w:t>
+      </w:r>
+      <w:r>
+        <w:rPr>
+          <w:i/>
+          <w:iCs/>
+          <w:color w:val="595959"/>
+        </w:rPr>
+        <w:t xml:space="preserve">Proposed by Claude (new suggestion). </w:t>
+      </w:r>
+      <w:r>
+        <w:t xml:space="preserve">Detects stagnant water in containers around the home (plant saucers, pails, gully traps) and drains or flags them before mosquitoes can breed. Tailored to Singapore.</w:t>
+      </w:r>
+    </w:p>
+    <w:tbl>
+      <w:tblPr>
+        <w:tblW w:type="dxa" w:w="9026"/>
+        <w:tblBorders>
+          <w:top w:val="single" w:color="auto" w:sz="4"/>
+          <w:left w:val="single" w:color="auto" w:sz="4"/>
+          <w:bottom w:val="single" w:color="auto" w:sz="4"/>
+          <w:right w:val="single" w:color="auto" w:sz="4"/>
+          <w:insideH w:val="single" w:color="auto" w:sz="4"/>
+          <w:insideV w:val="single" w:color="auto" w:sz="4"/>
+        </w:tblBorders>
+      </w:tblPr>
+      <w:tblGrid>
+        <w:gridCol w:w="2400"/>
+        <w:gridCol w:w="6626"/>
+      </w:tblGrid>
+      <w:tr>
+        <w:trPr>
+          <w:tblHeader/>
+        </w:trPr>
+        <w:tc>
+          <w:tcPr>
+            <w:tcW w:type="dxa" w:w="2400"/>
+            <w:tcBorders>
+              <w:top w:val="single" w:color="BFBFBF" w:sz="4"/>
+              <w:left w:val="single" w:color="BFBFBF" w:sz="4"/>
+              <w:bottom w:val="single" w:color="BFBFBF" w:sz="4"/>
+              <w:right w:val="single" w:color="BFBFBF" w:sz="4"/>
+            </w:tcBorders>
+            <w:shd w:fill="1F4E79" w:color="auto" w:val="clear"/>
+            <w:tcMar>
+              <w:top w:type="dxa" w:w="60"/>
+              <w:left w:type="dxa" w:w="100"/>
+              <w:bottom w:type="dxa" w:w="60"/>
+              <w:right w:type="dxa" w:w="100"/>
+            </w:tcMar>
+          </w:tcPr>
+          <w:p>
+            <w:r>
+              <w:rPr>
+                <w:b/>
+                <w:bCs/>
+                <w:color w:val="FFFFFF"/>
+              </w:rPr>
+              <w:t xml:space="preserve">Component</w:t>
+            </w:r>
+          </w:p>
+        </w:tc>
+        <w:tc>
+          <w:tcPr>
+            <w:tcW w:type="dxa" w:w="6626"/>
+            <w:tcBorders>
+              <w:top w:val="single" w:color="BFBFBF" w:sz="4"/>
+              <w:left w:val="single" w:color="BFBFBF" w:sz="4"/>
+              <w:bottom w:val="single" w:color="BFBFBF" w:sz="4"/>
+              <w:right w:val="single" w:color="BFBFBF" w:sz="4"/>
+            </w:tcBorders>
+            <w:shd w:fill="1F4E79" w:color="auto" w:val="clear"/>
+            <w:tcMar>
+              <w:top w:type="dxa" w:w="60"/>
+              <w:left w:type="dxa" w:w="100"/>
+              <w:bottom w:type="dxa" w:w="60"/>
+              <w:right w:type="dxa" w:w="100"/>
+            </w:tcMar>
+          </w:tcPr>
+          <w:p>
+            <w:r>
+              <w:rPr>
+                <w:b/>
+                <w:bCs/>
+                <w:color w:val="FFFFFF"/>
+              </w:rPr>
+              <w:t xml:space="preserve">Details</w:t>
+            </w:r>
+          </w:p>
+        </w:tc>
+      </w:tr>
+      <w:tr>
+        <w:trPr>
+          <w:cantSplit/>
+        </w:trPr>
+        <w:tc>
+          <w:tcPr>
+            <w:tcW w:type="dxa" w:w="2400"/>
+            <w:tcBorders>
+              <w:top w:val="single" w:color="BFBFBF" w:sz="4"/>
+              <w:left w:val="single" w:color="BFBFBF" w:sz="4"/>
+              <w:bottom w:val="single" w:color="BFBFBF" w:sz="4"/>
+              <w:right w:val="single" w:color="BFBFBF" w:sz="4"/>
+            </w:tcBorders>
+            <w:shd w:fill="DCE6F1" w:color="auto" w:val="clear"/>
+            <w:tcMar>
+              <w:top w:type="dxa" w:w="60"/>
+              <w:left w:type="dxa" w:w="100"/>
+              <w:bottom w:type="dxa" w:w="60"/>
+              <w:right w:type="dxa" w:w="100"/>
+            </w:tcMar>
+          </w:tcPr>
+          <w:p>
+            <w:r>
+              <w:rPr>
+                <w:b/>
+                <w:bCs/>
+              </w:rPr>
+              <w:t xml:space="preserve">ESP32 #1</w:t>
+            </w:r>
+          </w:p>
+        </w:tc>
+        <w:tc>
+          <w:tcPr>
+            <w:tcW w:type="dxa" w:w="6626"/>
+            <w:tcBorders>
+              <w:top w:val="single" w:color="BFBFBF" w:sz="4"/>
+              <w:left w:val="single" w:color="BFBFBF" w:sz="4"/>
+              <w:bottom w:val="single" w:color="BFBFBF" w:sz="4"/>
+              <w:right w:val="single" w:color="BFBFBF" w:sz="4"/>
+            </w:tcBorders>
+            <w:tcMar>
+              <w:top w:type="dxa" w:w="60"/>
+              <w:left w:type="dxa" w:w="100"/>
+              <w:bottom w:type="dxa" w:w="60"/>
+              <w:right w:type="dxa" w:w="100"/>
+            </w:tcMar>
+          </w:tcPr>
+          <w:p>
+            <w:r>
+              <w:t xml:space="preserve">Water-level sensor + waterproof temperature probe (DS18B20) in a container</w:t>
+            </w:r>
+          </w:p>
+        </w:tc>
+      </w:tr>
+      <w:tr>
+        <w:trPr>
+          <w:cantSplit/>
+        </w:trPr>
+        <w:tc>
+          <w:tcPr>
+            <w:tcW w:type="dxa" w:w="2400"/>
+            <w:tcBorders>
+              <w:top w:val="single" w:color="BFBFBF" w:sz="4"/>
+              <w:left w:val="single" w:color="BFBFBF" w:sz="4"/>
+              <w:bottom w:val="single" w:color="BFBFBF" w:sz="4"/>
+              <w:right w:val="single" w:color="BFBFBF" w:sz="4"/>
+            </w:tcBorders>
+            <w:shd w:fill="DCE6F1" w:color="auto" w:val="clear"/>
+            <w:tcMar>
+              <w:top w:type="dxa" w:w="60"/>
+              <w:left w:type="dxa" w:w="100"/>
+              <w:bottom w:type="dxa" w:w="60"/>
+              <w:right w:type="dxa" w:w="100"/>
+            </w:tcMar>
+          </w:tcPr>
+          <w:p>
+            <w:r>
+              <w:rPr>
+                <w:b/>
+                <w:bCs/>
+              </w:rPr>
+              <w:t xml:space="preserve">ESP32 #2</w:t>
+            </w:r>
+          </w:p>
+        </w:tc>
+        <w:tc>
+          <w:tcPr>
+            <w:tcW w:type="dxa" w:w="6626"/>
+            <w:tcBorders>
+              <w:top w:val="single" w:color="BFBFBF" w:sz="4"/>
+              <w:left w:val="single" w:color="BFBFBF" w:sz="4"/>
+              <w:bottom w:val="single" w:color="BFBFBF" w:sz="4"/>
+              <w:right w:val="single" w:color="BFBFBF" w:sz="4"/>
+            </w:tcBorders>
+            <w:tcMar>
+              <w:top w:type="dxa" w:w="60"/>
+              <w:left w:type="dxa" w:w="100"/>
+              <w:bottom w:type="dxa" w:w="60"/>
+              <w:right w:type="dxa" w:w="100"/>
+            </w:tcMar>
+          </w:tcPr>
+          <w:p>
+            <w:r>
+              <w:t xml:space="preserve">Second container / location, plus ambient temperature, humidity and light sensors</w:t>
+            </w:r>
+          </w:p>
+        </w:tc>
+      </w:tr>
+      <w:tr>
+        <w:trPr>
+          <w:cantSplit/>
+        </w:trPr>
+        <w:tc>
+          <w:tcPr>
+            <w:tcW w:type="dxa" w:w="2400"/>
+            <w:tcBorders>
+              <w:top w:val="single" w:color="BFBFBF" w:sz="4"/>
+              <w:left w:val="single" w:color="BFBFBF" w:sz="4"/>
+              <w:bottom w:val="single" w:color="BFBFBF" w:sz="4"/>
+              <w:right w:val="single" w:color="BFBFBF" w:sz="4"/>
+            </w:tcBorders>
+            <w:shd w:fill="DCE6F1" w:color="auto" w:val="clear"/>
+            <w:tcMar>
+              <w:top w:type="dxa" w:w="60"/>
+              <w:left w:type="dxa" w:w="100"/>
+              <w:bottom w:type="dxa" w:w="60"/>
+              <w:right w:type="dxa" w:w="100"/>
+            </w:tcMar>
+          </w:tcPr>
+          <w:p>
+            <w:r>
+              <w:rPr>
+                <w:b/>
+                <w:bCs/>
+              </w:rPr>
+              <w:t xml:space="preserve">Edge action (real-time)</w:t>
+            </w:r>
+          </w:p>
+        </w:tc>
+        <w:tc>
+          <w:tcPr>
+            <w:tcW w:type="dxa" w:w="6626"/>
+            <w:tcBorders>
+              <w:top w:val="single" w:color="BFBFBF" w:sz="4"/>
+              <w:left w:val="single" w:color="BFBFBF" w:sz="4"/>
+              <w:bottom w:val="single" w:color="BFBFBF" w:sz="4"/>
+              <w:right w:val="single" w:color="BFBFBF" w:sz="4"/>
+            </w:tcBorders>
+            <w:tcMar>
+              <w:top w:type="dxa" w:w="60"/>
+              <w:left w:type="dxa" w:w="100"/>
+              <w:bottom w:type="dxa" w:w="60"/>
+              <w:right w:type="dxa" w:w="100"/>
+            </w:tcMar>
+          </w:tcPr>
+          <w:p>
+            <w:r>
+              <w:t xml:space="preserve">Water has stood longer than a threshold → servo tips/opens a drain, LED/buzzer alert</w:t>
+            </w:r>
+          </w:p>
+        </w:tc>
+      </w:tr>
+      <w:tr>
+        <w:trPr>
+          <w:cantSplit/>
+        </w:trPr>
+        <w:tc>
+          <w:tcPr>
+            <w:tcW w:type="dxa" w:w="2400"/>
+            <w:tcBorders>
+              <w:top w:val="single" w:color="BFBFBF" w:sz="4"/>
+              <w:left w:val="single" w:color="BFBFBF" w:sz="4"/>
+              <w:bottom w:val="single" w:color="BFBFBF" w:sz="4"/>
+              <w:right w:val="single" w:color="BFBFBF" w:sz="4"/>
+            </w:tcBorders>
+            <w:shd w:fill="DCE6F1" w:color="auto" w:val="clear"/>
+            <w:tcMar>
+              <w:top w:type="dxa" w:w="60"/>
+              <w:left w:type="dxa" w:w="100"/>
+              <w:bottom w:type="dxa" w:w="60"/>
+              <w:right w:type="dxa" w:w="100"/>
+            </w:tcMar>
+          </w:tcPr>
+          <w:p>
+            <w:r>
+              <w:rPr>
+                <w:b/>
+                <w:bCs/>
+              </w:rPr>
+              <w:t xml:space="preserve">Actuator</w:t>
+            </w:r>
+          </w:p>
+        </w:tc>
+        <w:tc>
+          <w:tcPr>
+            <w:tcW w:type="dxa" w:w="6626"/>
+            <w:tcBorders>
+              <w:top w:val="single" w:color="BFBFBF" w:sz="4"/>
+              <w:left w:val="single" w:color="BFBFBF" w:sz="4"/>
+              <w:bottom w:val="single" w:color="BFBFBF" w:sz="4"/>
+              <w:right w:val="single" w:color="BFBFBF" w:sz="4"/>
+            </w:tcBorders>
+            <w:tcMar>
+              <w:top w:type="dxa" w:w="60"/>
+              <w:left w:type="dxa" w:w="100"/>
+              <w:bottom w:type="dxa" w:w="60"/>
+              <w:right w:type="dxa" w:w="100"/>
+            </w:tcMar>
+          </w:tcPr>
+          <w:p>
+            <w:r>
+              <w:t xml:space="preserve">Servo tips the container or opens a small drain valve</w:t>
+            </w:r>
+          </w:p>
+        </w:tc>
+      </w:tr>
+      <w:tr>
+        <w:trPr>
+          <w:cantSplit/>
+        </w:trPr>
+        <w:tc>
+          <w:tcPr>
+            <w:tcW w:type="dxa" w:w="2400"/>
+            <w:tcBorders>
+              <w:top w:val="single" w:color="BFBFBF" w:sz="4"/>
+              <w:left w:val="single" w:color="BFBFBF" w:sz="4"/>
+              <w:bottom w:val="single" w:color="BFBFBF" w:sz="4"/>
+              <w:right w:val="single" w:color="BFBFBF" w:sz="4"/>
+            </w:tcBorders>
+            <w:shd w:fill="DCE6F1" w:color="auto" w:val="clear"/>
+            <w:tcMar>
+              <w:top w:type="dxa" w:w="60"/>
+              <w:left w:type="dxa" w:w="100"/>
+              <w:bottom w:type="dxa" w:w="60"/>
+              <w:right w:type="dxa" w:w="100"/>
+            </w:tcMar>
+          </w:tcPr>
+          <w:p>
+            <w:r>
+              <w:rPr>
+                <w:b/>
+                <w:bCs/>
+              </w:rPr>
+              <w:t xml:space="preserve">ML</w:t>
+            </w:r>
+          </w:p>
+        </w:tc>
+        <w:tc>
+          <w:tcPr>
+            <w:tcW w:type="dxa" w:w="6626"/>
+            <w:tcBorders>
+              <w:top w:val="single" w:color="BFBFBF" w:sz="4"/>
+              <w:left w:val="single" w:color="BFBFBF" w:sz="4"/>
+              <w:bottom w:val="single" w:color="BFBFBF" w:sz="4"/>
+              <w:right w:val="single" w:color="BFBFBF" w:sz="4"/>
+            </w:tcBorders>
+            <w:tcMar>
+              <w:top w:type="dxa" w:w="60"/>
+              <w:left w:type="dxa" w:w="100"/>
+              <w:bottom w:type="dxa" w:w="60"/>
+              <w:right w:type="dxa" w:w="100"/>
+            </w:tcMar>
+          </w:tcPr>
+          <w:p>
+            <w:r>
+              <w:t xml:space="preserve">Breeding-risk model from standing-water duration, water temperature, humidity and rainfall; can be supplemented with NEA dengue-cluster and weather data</w:t>
+            </w:r>
+          </w:p>
+        </w:tc>
+      </w:tr>
+      <w:tr>
+        <w:trPr>
+          <w:cantSplit/>
+        </w:trPr>
+        <w:tc>
+          <w:tcPr>
+            <w:tcW w:type="dxa" w:w="2400"/>
+            <w:tcBorders>
+              <w:top w:val="single" w:color="BFBFBF" w:sz="4"/>
+              <w:left w:val="single" w:color="BFBFBF" w:sz="4"/>
+              <w:bottom w:val="single" w:color="BFBFBF" w:sz="4"/>
+              <w:right w:val="single" w:color="BFBFBF" w:sz="4"/>
+            </w:tcBorders>
+            <w:shd w:fill="DCE6F1" w:color="auto" w:val="clear"/>
+            <w:tcMar>
+              <w:top w:type="dxa" w:w="60"/>
+              <w:left w:type="dxa" w:w="100"/>
+              <w:bottom w:type="dxa" w:w="60"/>
+              <w:right w:type="dxa" w:w="100"/>
+            </w:tcMar>
+          </w:tcPr>
+          <w:p>
+            <w:r>
+              <w:rPr>
+                <w:b/>
+                <w:bCs/>
+              </w:rPr>
+              <w:t xml:space="preserve">Cloud (long-term)</w:t>
+            </w:r>
+          </w:p>
+        </w:tc>
+        <w:tc>
+          <w:tcPr>
+            <w:tcW w:type="dxa" w:w="6626"/>
+            <w:tcBorders>
+              <w:top w:val="single" w:color="BFBFBF" w:sz="4"/>
+              <w:left w:val="single" w:color="BFBFBF" w:sz="4"/>
+              <w:bottom w:val="single" w:color="BFBFBF" w:sz="4"/>
+              <w:right w:val="single" w:color="BFBFBF" w:sz="4"/>
+            </w:tcBorders>
+            <w:tcMar>
+              <w:top w:type="dxa" w:w="60"/>
+              <w:left w:type="dxa" w:w="100"/>
+              <w:bottom w:type="dxa" w:w="60"/>
+              <w:right w:type="dxa" w:w="100"/>
+            </w:tcMar>
+          </w:tcPr>
+          <w:p>
+            <w:r>
+              <w:t xml:space="preserve">Which containers fill up most often, weekly risk trend, correlation with rainfall, risk per location</w:t>
+            </w:r>
+          </w:p>
+        </w:tc>
+      </w:tr>
+      <w:tr>
+        <w:trPr>
+          <w:cantSplit/>
+        </w:trPr>
+        <w:tc>
+          <w:tcPr>
+            <w:tcW w:type="dxa" w:w="2400"/>
+            <w:tcBorders>
+              <w:top w:val="single" w:color="BFBFBF" w:sz="4"/>
+              <w:left w:val="single" w:color="BFBFBF" w:sz="4"/>
+              <w:bottom w:val="single" w:color="BFBFBF" w:sz="4"/>
+              <w:right w:val="single" w:color="BFBFBF" w:sz="4"/>
+            </w:tcBorders>
+            <w:shd w:fill="DCE6F1" w:color="auto" w:val="clear"/>
+            <w:tcMar>
+              <w:top w:type="dxa" w:w="60"/>
+              <w:left w:type="dxa" w:w="100"/>
+              <w:bottom w:type="dxa" w:w="60"/>
+              <w:right w:type="dxa" w:w="100"/>
+            </w:tcMar>
+          </w:tcPr>
+          <w:p>
+            <w:r>
+              <w:rPr>
+                <w:b/>
+                <w:bCs/>
+              </w:rPr>
+              <w:t xml:space="preserve">Demo</w:t>
+            </w:r>
+          </w:p>
+        </w:tc>
+        <w:tc>
+          <w:tcPr>
+            <w:tcW w:type="dxa" w:w="6626"/>
+            <w:tcBorders>
+              <w:top w:val="single" w:color="BFBFBF" w:sz="4"/>
+              <w:left w:val="single" w:color="BFBFBF" w:sz="4"/>
+              <w:bottom w:val="single" w:color="BFBFBF" w:sz="4"/>
+              <w:right w:val="single" w:color="BFBFBF" w:sz="4"/>
+            </w:tcBorders>
+            <w:tcMar>
+              <w:top w:type="dxa" w:w="60"/>
+              <w:left w:type="dxa" w:w="100"/>
+              <w:bottom w:type="dxa" w:w="60"/>
+              <w:right w:type="dxa" w:w="100"/>
+            </w:tcMar>
+          </w:tcPr>
+          <w:p>
+            <w:r>
+              <w:t xml:space="preserve">Pour water into the tray; after an accelerated timer the node flags it and the servo drains it; dashboard updates</w:t>
+            </w:r>
+          </w:p>
+        </w:tc>
+      </w:tr>
+    </w:tbl>
+    <w:p>
+      <w:pPr>
+        <w:pStyle w:val="Heading3"/>
+      </w:pPr>
+      <w:r>
+        <w:t xml:space="preserve">Notes against the brief</w:t>
+      </w:r>
+    </w:p>
+    <w:p>
+      <w:pPr>
+        <w:pStyle w:val="ListParagraph"/>
+        <w:numPr>
+          <w:ilvl w:val="0"/>
+          <w:numId w:val="2"/>
+        </w:numPr>
+        <w:spacing w:after="60"/>
+      </w:pPr>
+      <w:r>
+        <w:t xml:space="preserve">Very relevant to Singapore and not on the past-projects list, so it scores well on novelty.</w:t>
+      </w:r>
+    </w:p>
+    <w:p>
+      <w:pPr>
+        <w:pStyle w:val="ListParagraph"/>
+        <w:numPr>
+          <w:ilvl w:val="0"/>
+          <w:numId w:val="2"/>
+        </w:numPr>
+        <w:spacing w:after="60"/>
+      </w:pPr>
+      <w:r>
+        <w:t xml:space="preserve">Stagnant water changes slowly, so the demo and data collection need an accelerated time scale.</w:t>
+      </w:r>
+    </w:p>
+    <w:p>
+      <w:pPr>
+        <w:pStyle w:val="ListParagraph"/>
+        <w:numPr>
+          <w:ilvl w:val="0"/>
+          <w:numId w:val="2"/>
+        </w:numPr>
+        <w:spacing w:after="60"/>
+      </w:pPr>
+      <w:r>
+        <w:t xml:space="preserve">Needs waterproofing, and the tipping/draining mechanism needs a simple, reliable design.</w:t>
+      </w:r>
+    </w:p>
+    <w:p>
+      <w:pPr>
+        <w:spacing w:after="60"/>
+      </w:pPr>
+    </w:p>
+    <w:p>
+      <w:pPr>
+        <w:pStyle w:val="Heading2"/>
+        <w:keepNext/>
+      </w:pPr>
+      <w:r>
+        <w:t xml:space="preserve">Idea 9: Library / Study-Spot Seat Monitor</w:t>
+      </w:r>
+    </w:p>
+    <w:p>
+      <w:pPr>
+        <w:keepNext/>
+        <w:spacing w:after="100"/>
+      </w:pPr>
+      <w:r>
+        <w:rPr>
+          <w:b/>
+          <w:bCs/>
+          <w:color w:val="C55A11"/>
+        </w:rPr>
+        <w:t xml:space="preserve">NEW  </w:t>
+      </w:r>
+      <w:r>
+        <w:rPr>
+          <w:i/>
+          <w:iCs/>
+          <w:color w:val="595959"/>
+        </w:rPr>
+        <w:t xml:space="preserve">Proposed by Claude (new suggestion). </w:t>
+      </w:r>
+      <w:r>
+        <w:t xml:space="preserve">Shows which study seats are really free, detects "seat hogging" (belongings left with nobody there) and forecasts how busy a study area will be.</w:t>
+      </w:r>
+    </w:p>
+    <w:tbl>
+      <w:tblPr>
+        <w:tblW w:type="dxa" w:w="9026"/>
+        <w:tblBorders>
+          <w:top w:val="single" w:color="auto" w:sz="4"/>
+          <w:left w:val="single" w:color="auto" w:sz="4"/>
+          <w:bottom w:val="single" w:color="auto" w:sz="4"/>
+          <w:right w:val="single" w:color="auto" w:sz="4"/>
+          <w:insideH w:val="single" w:color="auto" w:sz="4"/>
+          <w:insideV w:val="single" w:color="auto" w:sz="4"/>
+        </w:tblBorders>
+      </w:tblPr>
+      <w:tblGrid>
+        <w:gridCol w:w="2400"/>
+        <w:gridCol w:w="6626"/>
+      </w:tblGrid>
+      <w:tr>
+        <w:trPr>
+          <w:tblHeader/>
+        </w:trPr>
+        <w:tc>
+          <w:tcPr>
+            <w:tcW w:type="dxa" w:w="2400"/>
+            <w:tcBorders>
+              <w:top w:val="single" w:color="BFBFBF" w:sz="4"/>
+              <w:left w:val="single" w:color="BFBFBF" w:sz="4"/>
+              <w:bottom w:val="single" w:color="BFBFBF" w:sz="4"/>
+              <w:right w:val="single" w:color="BFBFBF" w:sz="4"/>
+            </w:tcBorders>
+            <w:shd w:fill="1F4E79" w:color="auto" w:val="clear"/>
+            <w:tcMar>
+              <w:top w:type="dxa" w:w="60"/>
+              <w:left w:type="dxa" w:w="100"/>
+              <w:bottom w:type="dxa" w:w="60"/>
+              <w:right w:type="dxa" w:w="100"/>
+            </w:tcMar>
+          </w:tcPr>
+          <w:p>
+            <w:r>
+              <w:rPr>
+                <w:b/>
+                <w:bCs/>
+                <w:color w:val="FFFFFF"/>
+              </w:rPr>
+              <w:t xml:space="preserve">Component</w:t>
+            </w:r>
+          </w:p>
+        </w:tc>
+        <w:tc>
+          <w:tcPr>
+            <w:tcW w:type="dxa" w:w="6626"/>
+            <w:tcBorders>
+              <w:top w:val="single" w:color="BFBFBF" w:sz="4"/>
+              <w:left w:val="single" w:color="BFBFBF" w:sz="4"/>
+              <w:bottom w:val="single" w:color="BFBFBF" w:sz="4"/>
+              <w:right w:val="single" w:color="BFBFBF" w:sz="4"/>
+            </w:tcBorders>
+            <w:shd w:fill="1F4E79" w:color="auto" w:val="clear"/>
+            <w:tcMar>
+              <w:top w:type="dxa" w:w="60"/>
+              <w:left w:type="dxa" w:w="100"/>
+              <w:bottom w:type="dxa" w:w="60"/>
+              <w:right w:type="dxa" w:w="100"/>
+            </w:tcMar>
+          </w:tcPr>
+          <w:p>
+            <w:r>
+              <w:rPr>
+                <w:b/>
+                <w:bCs/>
+                <w:color w:val="FFFFFF"/>
+              </w:rPr>
+              <w:t xml:space="preserve">Details</w:t>
+            </w:r>
+          </w:p>
+        </w:tc>
+      </w:tr>
+      <w:tr>
+        <w:trPr>
+          <w:cantSplit/>
+        </w:trPr>
+        <w:tc>
+          <w:tcPr>
+            <w:tcW w:type="dxa" w:w="2400"/>
+            <w:tcBorders>
+              <w:top w:val="single" w:color="BFBFBF" w:sz="4"/>
+              <w:left w:val="single" w:color="BFBFBF" w:sz="4"/>
+              <w:bottom w:val="single" w:color="BFBFBF" w:sz="4"/>
+              <w:right w:val="single" w:color="BFBFBF" w:sz="4"/>
+            </w:tcBorders>
+            <w:shd w:fill="DCE6F1" w:color="auto" w:val="clear"/>
+            <w:tcMar>
+              <w:top w:type="dxa" w:w="60"/>
+              <w:left w:type="dxa" w:w="100"/>
+              <w:bottom w:type="dxa" w:w="60"/>
+              <w:right w:type="dxa" w:w="100"/>
+            </w:tcMar>
+          </w:tcPr>
+          <w:p>
+            <w:r>
+              <w:rPr>
+                <w:b/>
+                <w:bCs/>
+              </w:rPr>
+              <w:t xml:space="preserve">ESP32 #1 (per desk)</w:t>
+            </w:r>
+          </w:p>
+        </w:tc>
+        <w:tc>
+          <w:tcPr>
+            <w:tcW w:type="dxa" w:w="6626"/>
+            <w:tcBorders>
+              <w:top w:val="single" w:color="BFBFBF" w:sz="4"/>
+              <w:left w:val="single" w:color="BFBFBF" w:sz="4"/>
+              <w:bottom w:val="single" w:color="BFBFBF" w:sz="4"/>
+              <w:right w:val="single" w:color="BFBFBF" w:sz="4"/>
+            </w:tcBorders>
+            <w:tcMar>
+              <w:top w:type="dxa" w:w="60"/>
+              <w:left w:type="dxa" w:w="100"/>
+              <w:bottom w:type="dxa" w:w="60"/>
+              <w:right w:type="dxa" w:w="100"/>
+            </w:tcMar>
+          </w:tcPr>
+          <w:p>
+            <w:r>
+              <w:t xml:space="preserve">PIR or mmWave presence sensor + pressure pad / load cell on the seat</w:t>
+            </w:r>
+          </w:p>
+        </w:tc>
+      </w:tr>
+      <w:tr>
+        <w:trPr>
+          <w:cantSplit/>
+        </w:trPr>
+        <w:tc>
+          <w:tcPr>
+            <w:tcW w:type="dxa" w:w="2400"/>
+            <w:tcBorders>
+              <w:top w:val="single" w:color="BFBFBF" w:sz="4"/>
+              <w:left w:val="single" w:color="BFBFBF" w:sz="4"/>
+              <w:bottom w:val="single" w:color="BFBFBF" w:sz="4"/>
+              <w:right w:val="single" w:color="BFBFBF" w:sz="4"/>
+            </w:tcBorders>
+            <w:shd w:fill="DCE6F1" w:color="auto" w:val="clear"/>
+            <w:tcMar>
+              <w:top w:type="dxa" w:w="60"/>
+              <w:left w:type="dxa" w:w="100"/>
+              <w:bottom w:type="dxa" w:w="60"/>
+              <w:right w:type="dxa" w:w="100"/>
+            </w:tcMar>
+          </w:tcPr>
+          <w:p>
+            <w:r>
+              <w:rPr>
+                <w:b/>
+                <w:bCs/>
+              </w:rPr>
+              <w:t xml:space="preserve">ESP32 #2 (per desk / area)</w:t>
+            </w:r>
+          </w:p>
+        </w:tc>
+        <w:tc>
+          <w:tcPr>
+            <w:tcW w:type="dxa" w:w="6626"/>
+            <w:tcBorders>
+              <w:top w:val="single" w:color="BFBFBF" w:sz="4"/>
+              <w:left w:val="single" w:color="BFBFBF" w:sz="4"/>
+              <w:bottom w:val="single" w:color="BFBFBF" w:sz="4"/>
+              <w:right w:val="single" w:color="BFBFBF" w:sz="4"/>
+            </w:tcBorders>
+            <w:tcMar>
+              <w:top w:type="dxa" w:w="60"/>
+              <w:left w:type="dxa" w:w="100"/>
+              <w:bottom w:type="dxa" w:w="60"/>
+              <w:right w:type="dxa" w:w="100"/>
+            </w:tcMar>
+          </w:tcPr>
+          <w:p>
+            <w:r>
+              <w:t xml:space="preserve">Microphone for noise level + light sensor; a second desk for multi-node data</w:t>
+            </w:r>
+          </w:p>
+        </w:tc>
+      </w:tr>
+      <w:tr>
+        <w:trPr>
+          <w:cantSplit/>
+        </w:trPr>
+        <w:tc>
+          <w:tcPr>
+            <w:tcW w:type="dxa" w:w="2400"/>
+            <w:tcBorders>
+              <w:top w:val="single" w:color="BFBFBF" w:sz="4"/>
+              <w:left w:val="single" w:color="BFBFBF" w:sz="4"/>
+              <w:bottom w:val="single" w:color="BFBFBF" w:sz="4"/>
+              <w:right w:val="single" w:color="BFBFBF" w:sz="4"/>
+            </w:tcBorders>
+            <w:shd w:fill="DCE6F1" w:color="auto" w:val="clear"/>
+            <w:tcMar>
+              <w:top w:type="dxa" w:w="60"/>
+              <w:left w:type="dxa" w:w="100"/>
+              <w:bottom w:type="dxa" w:w="60"/>
+              <w:right w:type="dxa" w:w="100"/>
+            </w:tcMar>
+          </w:tcPr>
+          <w:p>
+            <w:r>
+              <w:rPr>
+                <w:b/>
+                <w:bCs/>
+              </w:rPr>
+              <w:t xml:space="preserve">Edge action (real-time)</w:t>
+            </w:r>
+          </w:p>
+        </w:tc>
+        <w:tc>
+          <w:tcPr>
+            <w:tcW w:type="dxa" w:w="6626"/>
+            <w:tcBorders>
+              <w:top w:val="single" w:color="BFBFBF" w:sz="4"/>
+              <w:left w:val="single" w:color="BFBFBF" w:sz="4"/>
+              <w:bottom w:val="single" w:color="BFBFBF" w:sz="4"/>
+              <w:right w:val="single" w:color="BFBFBF" w:sz="4"/>
+            </w:tcBorders>
+            <w:tcMar>
+              <w:top w:type="dxa" w:w="60"/>
+              <w:left w:type="dxa" w:w="100"/>
+              <w:bottom w:type="dxa" w:w="60"/>
+              <w:right w:type="dxa" w:w="100"/>
+            </w:tcMar>
+          </w:tcPr>
+          <w:p>
+            <w:r>
+              <w:t xml:space="preserve">Items on seat but no person for &gt; N minutes → LED turns amber ("hogged"); instant status change when someone sits or leaves</w:t>
+            </w:r>
+          </w:p>
+        </w:tc>
+      </w:tr>
+      <w:tr>
+        <w:trPr>
+          <w:cantSplit/>
+        </w:trPr>
+        <w:tc>
+          <w:tcPr>
+            <w:tcW w:type="dxa" w:w="2400"/>
+            <w:tcBorders>
+              <w:top w:val="single" w:color="BFBFBF" w:sz="4"/>
+              <w:left w:val="single" w:color="BFBFBF" w:sz="4"/>
+              <w:bottom w:val="single" w:color="BFBFBF" w:sz="4"/>
+              <w:right w:val="single" w:color="BFBFBF" w:sz="4"/>
+            </w:tcBorders>
+            <w:shd w:fill="DCE6F1" w:color="auto" w:val="clear"/>
+            <w:tcMar>
+              <w:top w:type="dxa" w:w="60"/>
+              <w:left w:type="dxa" w:w="100"/>
+              <w:bottom w:type="dxa" w:w="60"/>
+              <w:right w:type="dxa" w:w="100"/>
+            </w:tcMar>
+          </w:tcPr>
+          <w:p>
+            <w:r>
+              <w:rPr>
+                <w:b/>
+                <w:bCs/>
+              </w:rPr>
+              <w:t xml:space="preserve">Actuator</w:t>
+            </w:r>
+          </w:p>
+        </w:tc>
+        <w:tc>
+          <w:tcPr>
+            <w:tcW w:type="dxa" w:w="6626"/>
+            <w:tcBorders>
+              <w:top w:val="single" w:color="BFBFBF" w:sz="4"/>
+              <w:left w:val="single" w:color="BFBFBF" w:sz="4"/>
+              <w:bottom w:val="single" w:color="BFBFBF" w:sz="4"/>
+              <w:right w:val="single" w:color="BFBFBF" w:sz="4"/>
+            </w:tcBorders>
+            <w:tcMar>
+              <w:top w:type="dxa" w:w="60"/>
+              <w:left w:type="dxa" w:w="100"/>
+              <w:bottom w:type="dxa" w:w="60"/>
+              <w:right w:type="dxa" w:w="100"/>
+            </w:tcMar>
+          </w:tcPr>
+          <w:p>
+            <w:r>
+              <w:t xml:space="preserve">RGB LED / small display showing free / occupied / hogged</w:t>
+            </w:r>
+          </w:p>
+        </w:tc>
+      </w:tr>
+      <w:tr>
+        <w:trPr>
+          <w:cantSplit/>
+        </w:trPr>
+        <w:tc>
+          <w:tcPr>
+            <w:tcW w:type="dxa" w:w="2400"/>
+            <w:tcBorders>
+              <w:top w:val="single" w:color="BFBFBF" w:sz="4"/>
+              <w:left w:val="single" w:color="BFBFBF" w:sz="4"/>
+              <w:bottom w:val="single" w:color="BFBFBF" w:sz="4"/>
+              <w:right w:val="single" w:color="BFBFBF" w:sz="4"/>
+            </w:tcBorders>
+            <w:shd w:fill="DCE6F1" w:color="auto" w:val="clear"/>
+            <w:tcMar>
+              <w:top w:type="dxa" w:w="60"/>
+              <w:left w:type="dxa" w:w="100"/>
+              <w:bottom w:type="dxa" w:w="60"/>
+              <w:right w:type="dxa" w:w="100"/>
+            </w:tcMar>
+          </w:tcPr>
+          <w:p>
+            <w:r>
+              <w:rPr>
+                <w:b/>
+                <w:bCs/>
+              </w:rPr>
+              <w:t xml:space="preserve">ML</w:t>
+            </w:r>
+          </w:p>
+        </w:tc>
+        <w:tc>
+          <w:tcPr>
+            <w:tcW w:type="dxa" w:w="6626"/>
+            <w:tcBorders>
+              <w:top w:val="single" w:color="BFBFBF" w:sz="4"/>
+              <w:left w:val="single" w:color="BFBFBF" w:sz="4"/>
+              <w:bottom w:val="single" w:color="BFBFBF" w:sz="4"/>
+              <w:right w:val="single" w:color="BFBFBF" w:sz="4"/>
+            </w:tcBorders>
+            <w:tcMar>
+              <w:top w:type="dxa" w:w="60"/>
+              <w:left w:type="dxa" w:w="100"/>
+              <w:bottom w:type="dxa" w:w="60"/>
+              <w:right w:type="dxa" w:w="100"/>
+            </w:tcMar>
+          </w:tcPr>
+          <w:p>
+            <w:r>
+              <w:t xml:space="preserve">Occupancy classifier fusing presence + pressure + noise; LSTM forecasting of area occupancy by time of day</w:t>
+            </w:r>
+          </w:p>
+        </w:tc>
+      </w:tr>
+      <w:tr>
+        <w:trPr>
+          <w:cantSplit/>
+        </w:trPr>
+        <w:tc>
+          <w:tcPr>
+            <w:tcW w:type="dxa" w:w="2400"/>
+            <w:tcBorders>
+              <w:top w:val="single" w:color="BFBFBF" w:sz="4"/>
+              <w:left w:val="single" w:color="BFBFBF" w:sz="4"/>
+              <w:bottom w:val="single" w:color="BFBFBF" w:sz="4"/>
+              <w:right w:val="single" w:color="BFBFBF" w:sz="4"/>
+            </w:tcBorders>
+            <w:shd w:fill="DCE6F1" w:color="auto" w:val="clear"/>
+            <w:tcMar>
+              <w:top w:type="dxa" w:w="60"/>
+              <w:left w:type="dxa" w:w="100"/>
+              <w:bottom w:type="dxa" w:w="60"/>
+              <w:right w:type="dxa" w:w="100"/>
+            </w:tcMar>
+          </w:tcPr>
+          <w:p>
+            <w:r>
+              <w:rPr>
+                <w:b/>
+                <w:bCs/>
+              </w:rPr>
+              <w:t xml:space="preserve">Cloud (long-term)</w:t>
+            </w:r>
+          </w:p>
+        </w:tc>
+        <w:tc>
+          <w:tcPr>
+            <w:tcW w:type="dxa" w:w="6626"/>
+            <w:tcBorders>
+              <w:top w:val="single" w:color="BFBFBF" w:sz="4"/>
+              <w:left w:val="single" w:color="BFBFBF" w:sz="4"/>
+              <w:bottom w:val="single" w:color="BFBFBF" w:sz="4"/>
+              <w:right w:val="single" w:color="BFBFBF" w:sz="4"/>
+            </w:tcBorders>
+            <w:tcMar>
+              <w:top w:type="dxa" w:w="60"/>
+              <w:left w:type="dxa" w:w="100"/>
+              <w:bottom w:type="dxa" w:w="60"/>
+              <w:right w:type="dxa" w:w="100"/>
+            </w:tcMar>
+          </w:tcPr>
+          <w:p>
+            <w:r>
+              <w:t xml:space="preserve">Occupancy history, peak-hour trends, hogging statistics, predicted free seats in the next hour</w:t>
+            </w:r>
+          </w:p>
+        </w:tc>
+      </w:tr>
+      <w:tr>
+        <w:trPr>
+          <w:cantSplit/>
+        </w:trPr>
+        <w:tc>
+          <w:tcPr>
+            <w:tcW w:type="dxa" w:w="2400"/>
+            <w:tcBorders>
+              <w:top w:val="single" w:color="BFBFBF" w:sz="4"/>
+              <w:left w:val="single" w:color="BFBFBF" w:sz="4"/>
+              <w:bottom w:val="single" w:color="BFBFBF" w:sz="4"/>
+              <w:right w:val="single" w:color="BFBFBF" w:sz="4"/>
+            </w:tcBorders>
+            <w:shd w:fill="DCE6F1" w:color="auto" w:val="clear"/>
+            <w:tcMar>
+              <w:top w:type="dxa" w:w="60"/>
+              <w:left w:type="dxa" w:w="100"/>
+              <w:bottom w:type="dxa" w:w="60"/>
+              <w:right w:type="dxa" w:w="100"/>
+            </w:tcMar>
+          </w:tcPr>
+          <w:p>
+            <w:r>
+              <w:rPr>
+                <w:b/>
+                <w:bCs/>
+              </w:rPr>
+              <w:t xml:space="preserve">App / gateway</w:t>
+            </w:r>
+          </w:p>
+        </w:tc>
+        <w:tc>
+          <w:tcPr>
+            <w:tcW w:type="dxa" w:w="6626"/>
+            <w:tcBorders>
+              <w:top w:val="single" w:color="BFBFBF" w:sz="4"/>
+              <w:left w:val="single" w:color="BFBFBF" w:sz="4"/>
+              <w:bottom w:val="single" w:color="BFBFBF" w:sz="4"/>
+              <w:right w:val="single" w:color="BFBFBF" w:sz="4"/>
+            </w:tcBorders>
+            <w:tcMar>
+              <w:top w:type="dxa" w:w="60"/>
+              <w:left w:type="dxa" w:w="100"/>
+              <w:bottom w:type="dxa" w:w="60"/>
+              <w:right w:type="dxa" w:w="100"/>
+            </w:tcMar>
+          </w:tcPr>
+          <w:p>
+            <w:r>
+              <w:t xml:space="preserve">Phone app or web page showing a live seat map and forecasts</w:t>
+            </w:r>
+          </w:p>
+        </w:tc>
+      </w:tr>
+      <w:tr>
+        <w:trPr>
+          <w:cantSplit/>
+        </w:trPr>
+        <w:tc>
+          <w:tcPr>
+            <w:tcW w:type="dxa" w:w="2400"/>
+            <w:tcBorders>
+              <w:top w:val="single" w:color="BFBFBF" w:sz="4"/>
+              <w:left w:val="single" w:color="BFBFBF" w:sz="4"/>
+              <w:bottom w:val="single" w:color="BFBFBF" w:sz="4"/>
+              <w:right w:val="single" w:color="BFBFBF" w:sz="4"/>
+            </w:tcBorders>
+            <w:shd w:fill="DCE6F1" w:color="auto" w:val="clear"/>
+            <w:tcMar>
+              <w:top w:type="dxa" w:w="60"/>
+              <w:left w:type="dxa" w:w="100"/>
+              <w:bottom w:type="dxa" w:w="60"/>
+              <w:right w:type="dxa" w:w="100"/>
+            </w:tcMar>
+          </w:tcPr>
+          <w:p>
+            <w:r>
+              <w:rPr>
+                <w:b/>
+                <w:bCs/>
+              </w:rPr>
+              <w:t xml:space="preserve">Demo</w:t>
+            </w:r>
+          </w:p>
+        </w:tc>
+        <w:tc>
+          <w:tcPr>
+            <w:tcW w:type="dxa" w:w="6626"/>
+            <w:tcBorders>
+              <w:top w:val="single" w:color="BFBFBF" w:sz="4"/>
+              <w:left w:val="single" w:color="BFBFBF" w:sz="4"/>
+              <w:bottom w:val="single" w:color="BFBFBF" w:sz="4"/>
+              <w:right w:val="single" w:color="BFBFBF" w:sz="4"/>
+            </w:tcBorders>
+            <w:tcMar>
+              <w:top w:type="dxa" w:w="60"/>
+              <w:left w:type="dxa" w:w="100"/>
+              <w:bottom w:type="dxa" w:w="60"/>
+              <w:right w:type="dxa" w:w="100"/>
+            </w:tcMar>
+          </w:tcPr>
+          <w:p>
+            <w:r>
+              <w:t xml:space="preserve">Sit down → green to red; leave a bag and walk away → amber after a shortened timer; dashboard shows live map</w:t>
+            </w:r>
+          </w:p>
+        </w:tc>
+      </w:tr>
+    </w:tbl>
+    <w:p>
+      <w:pPr>
+        <w:pStyle w:val="Heading3"/>
+      </w:pPr>
+      <w:r>
+        <w:t xml:space="preserve">Notes against the brief</w:t>
+      </w:r>
+    </w:p>
+    <w:p>
+      <w:pPr>
+        <w:pStyle w:val="ListParagraph"/>
+        <w:numPr>
+          <w:ilvl w:val="0"/>
+          <w:numId w:val="2"/>
+        </w:numPr>
+        <w:spacing w:after="60"/>
+      </w:pPr>
+      <w:r>
+        <w:t xml:space="preserve">A problem every NUS student and marker knows, with a clear, quick demo and cheap hardware.</w:t>
+      </w:r>
+    </w:p>
+    <w:p>
+      <w:pPr>
+        <w:pStyle w:val="ListParagraph"/>
+        <w:numPr>
+          <w:ilvl w:val="0"/>
+          <w:numId w:val="2"/>
+        </w:numPr>
+        <w:spacing w:after="60"/>
+      </w:pPr>
+      <w:r>
+        <w:t xml:space="preserve">Real occupancy data takes time to collect; we would log in an actual study area or simulate usage patterns.</w:t>
+      </w:r>
+    </w:p>
+    <w:p>
+      <w:pPr>
+        <w:pStyle w:val="ListParagraph"/>
+        <w:numPr>
+          <w:ilvl w:val="0"/>
+          <w:numId w:val="2"/>
+        </w:numPr>
+        <w:spacing w:after="60"/>
+      </w:pPr>
+      <w:r>
+        <w:t xml:space="preserve">Keep it privacy-friendly: no cameras, only presence, pressure and noise levels.</w:t>
       </w:r>
     </w:p>
     <w:p>
@@ -4311,6 +6165,9 @@
         </w:tc>
       </w:tr>
       <w:tr>
+        <w:trPr>
+          <w:cantSplit/>
+        </w:trPr>
         <w:tc>
           <w:tcPr>
             <w:tcW w:type="dxa" w:w="2126"/>
@@ -4490,6 +6347,9 @@
         </w:tc>
       </w:tr>
       <w:tr>
+        <w:trPr>
+          <w:cantSplit/>
+        </w:trPr>
         <w:tc>
           <w:tcPr>
             <w:tcW w:type="dxa" w:w="2126"/>
@@ -4669,6 +6529,9 @@
         </w:tc>
       </w:tr>
       <w:tr>
+        <w:trPr>
+          <w:cantSplit/>
+        </w:trPr>
         <w:tc>
           <w:tcPr>
             <w:tcW w:type="dxa" w:w="2126"/>
@@ -4848,6 +6711,9 @@
         </w:tc>
       </w:tr>
       <w:tr>
+        <w:trPr>
+          <w:cantSplit/>
+        </w:trPr>
         <w:tc>
           <w:tcPr>
             <w:tcW w:type="dxa" w:w="2126"/>
@@ -5027,6 +6893,9 @@
         </w:tc>
       </w:tr>
       <w:tr>
+        <w:trPr>
+          <w:cantSplit/>
+        </w:trPr>
         <w:tc>
           <w:tcPr>
             <w:tcW w:type="dxa" w:w="2126"/>
@@ -5206,6 +7075,9 @@
         </w:tc>
       </w:tr>
       <w:tr>
+        <w:trPr>
+          <w:cantSplit/>
+        </w:trPr>
         <w:tc>
           <w:tcPr>
             <w:tcW w:type="dxa" w:w="2126"/>
@@ -5384,29 +7256,560 @@
           </w:p>
         </w:tc>
       </w:tr>
+      <w:tr>
+        <w:trPr>
+          <w:cantSplit/>
+        </w:trPr>
+        <w:tc>
+          <w:tcPr>
+            <w:tcW w:type="dxa" w:w="2126"/>
+            <w:tcBorders>
+              <w:top w:val="single" w:color="BFBFBF" w:sz="4"/>
+              <w:left w:val="single" w:color="BFBFBF" w:sz="4"/>
+              <w:bottom w:val="single" w:color="BFBFBF" w:sz="4"/>
+              <w:right w:val="single" w:color="BFBFBF" w:sz="4"/>
+            </w:tcBorders>
+            <w:shd w:fill="F2F2F2" w:color="auto" w:val="clear"/>
+            <w:tcMar>
+              <w:top w:type="dxa" w:w="60"/>
+              <w:left w:type="dxa" w:w="100"/>
+              <w:bottom w:type="dxa" w:w="60"/>
+              <w:right w:type="dxa" w:w="100"/>
+            </w:tcMar>
+          </w:tcPr>
+          <w:p>
+            <w:r>
+              <w:rPr>
+                <w:b/>
+                <w:bCs/>
+              </w:rPr>
+              <w:t xml:space="preserve">7. Predictive maintenance</w:t>
+            </w:r>
+          </w:p>
+        </w:tc>
+        <w:tc>
+          <w:tcPr>
+            <w:tcW w:type="dxa" w:w="1150"/>
+            <w:tcBorders>
+              <w:top w:val="single" w:color="BFBFBF" w:sz="4"/>
+              <w:left w:val="single" w:color="BFBFBF" w:sz="4"/>
+              <w:bottom w:val="single" w:color="BFBFBF" w:sz="4"/>
+              <w:right w:val="single" w:color="BFBFBF" w:sz="4"/>
+            </w:tcBorders>
+            <w:tcMar>
+              <w:top w:type="dxa" w:w="60"/>
+              <w:left w:type="dxa" w:w="100"/>
+              <w:bottom w:type="dxa" w:w="60"/>
+              <w:right w:type="dxa" w:w="100"/>
+            </w:tcMar>
+          </w:tcPr>
+          <w:p>
+            <w:pPr>
+              <w:jc w:val="center"/>
+            </w:pPr>
+            <w:r>
+              <w:t xml:space="preserve">Med–High</w:t>
+            </w:r>
+          </w:p>
+        </w:tc>
+        <w:tc>
+          <w:tcPr>
+            <w:tcW w:type="dxa" w:w="1150"/>
+            <w:tcBorders>
+              <w:top w:val="single" w:color="BFBFBF" w:sz="4"/>
+              <w:left w:val="single" w:color="BFBFBF" w:sz="4"/>
+              <w:bottom w:val="single" w:color="BFBFBF" w:sz="4"/>
+              <w:right w:val="single" w:color="BFBFBF" w:sz="4"/>
+            </w:tcBorders>
+            <w:tcMar>
+              <w:top w:type="dxa" w:w="60"/>
+              <w:left w:type="dxa" w:w="100"/>
+              <w:bottom w:type="dxa" w:w="60"/>
+              <w:right w:type="dxa" w:w="100"/>
+            </w:tcMar>
+          </w:tcPr>
+          <w:p>
+            <w:pPr>
+              <w:jc w:val="center"/>
+            </w:pPr>
+            <w:r>
+              <w:t xml:space="preserve">High</w:t>
+            </w:r>
+          </w:p>
+        </w:tc>
+        <w:tc>
+          <w:tcPr>
+            <w:tcW w:type="dxa" w:w="1150"/>
+            <w:tcBorders>
+              <w:top w:val="single" w:color="BFBFBF" w:sz="4"/>
+              <w:left w:val="single" w:color="BFBFBF" w:sz="4"/>
+              <w:bottom w:val="single" w:color="BFBFBF" w:sz="4"/>
+              <w:right w:val="single" w:color="BFBFBF" w:sz="4"/>
+            </w:tcBorders>
+            <w:tcMar>
+              <w:top w:type="dxa" w:w="60"/>
+              <w:left w:type="dxa" w:w="100"/>
+              <w:bottom w:type="dxa" w:w="60"/>
+              <w:right w:type="dxa" w:w="100"/>
+            </w:tcMar>
+          </w:tcPr>
+          <w:p>
+            <w:pPr>
+              <w:jc w:val="center"/>
+            </w:pPr>
+            <w:r>
+              <w:t xml:space="preserve">Low</w:t>
+            </w:r>
+          </w:p>
+        </w:tc>
+        <w:tc>
+          <w:tcPr>
+            <w:tcW w:type="dxa" w:w="1150"/>
+            <w:tcBorders>
+              <w:top w:val="single" w:color="BFBFBF" w:sz="4"/>
+              <w:left w:val="single" w:color="BFBFBF" w:sz="4"/>
+              <w:bottom w:val="single" w:color="BFBFBF" w:sz="4"/>
+              <w:right w:val="single" w:color="BFBFBF" w:sz="4"/>
+            </w:tcBorders>
+            <w:tcMar>
+              <w:top w:type="dxa" w:w="60"/>
+              <w:left w:type="dxa" w:w="100"/>
+              <w:bottom w:type="dxa" w:w="60"/>
+              <w:right w:type="dxa" w:w="100"/>
+            </w:tcMar>
+          </w:tcPr>
+          <w:p>
+            <w:pPr>
+              <w:jc w:val="center"/>
+            </w:pPr>
+            <w:r>
+              <w:t xml:space="preserve">Low</w:t>
+            </w:r>
+          </w:p>
+        </w:tc>
+        <w:tc>
+          <w:tcPr>
+            <w:tcW w:type="dxa" w:w="1150"/>
+            <w:tcBorders>
+              <w:top w:val="single" w:color="BFBFBF" w:sz="4"/>
+              <w:left w:val="single" w:color="BFBFBF" w:sz="4"/>
+              <w:bottom w:val="single" w:color="BFBFBF" w:sz="4"/>
+              <w:right w:val="single" w:color="BFBFBF" w:sz="4"/>
+            </w:tcBorders>
+            <w:tcMar>
+              <w:top w:type="dxa" w:w="60"/>
+              <w:left w:type="dxa" w:w="100"/>
+              <w:bottom w:type="dxa" w:w="60"/>
+              <w:right w:type="dxa" w:w="100"/>
+            </w:tcMar>
+          </w:tcPr>
+          <w:p>
+            <w:pPr>
+              <w:jc w:val="center"/>
+            </w:pPr>
+            <w:r>
+              <w:t xml:space="preserve">Easy</w:t>
+            </w:r>
+          </w:p>
+        </w:tc>
+        <w:tc>
+          <w:tcPr>
+            <w:tcW w:type="dxa" w:w="1150"/>
+            <w:tcBorders>
+              <w:top w:val="single" w:color="BFBFBF" w:sz="4"/>
+              <w:left w:val="single" w:color="BFBFBF" w:sz="4"/>
+              <w:bottom w:val="single" w:color="BFBFBF" w:sz="4"/>
+              <w:right w:val="single" w:color="BFBFBF" w:sz="4"/>
+            </w:tcBorders>
+            <w:tcMar>
+              <w:top w:type="dxa" w:w="60"/>
+              <w:left w:type="dxa" w:w="100"/>
+              <w:bottom w:type="dxa" w:w="60"/>
+              <w:right w:type="dxa" w:w="100"/>
+            </w:tcMar>
+          </w:tcPr>
+          <w:p>
+            <w:pPr>
+              <w:jc w:val="center"/>
+            </w:pPr>
+            <w:r>
+              <w:t xml:space="preserve">Good</w:t>
+            </w:r>
+          </w:p>
+        </w:tc>
+      </w:tr>
+      <w:tr>
+        <w:trPr>
+          <w:cantSplit/>
+        </w:trPr>
+        <w:tc>
+          <w:tcPr>
+            <w:tcW w:type="dxa" w:w="2126"/>
+            <w:tcBorders>
+              <w:top w:val="single" w:color="BFBFBF" w:sz="4"/>
+              <w:left w:val="single" w:color="BFBFBF" w:sz="4"/>
+              <w:bottom w:val="single" w:color="BFBFBF" w:sz="4"/>
+              <w:right w:val="single" w:color="BFBFBF" w:sz="4"/>
+            </w:tcBorders>
+            <w:shd w:fill="F2F2F2" w:color="auto" w:val="clear"/>
+            <w:tcMar>
+              <w:top w:type="dxa" w:w="60"/>
+              <w:left w:type="dxa" w:w="100"/>
+              <w:bottom w:type="dxa" w:w="60"/>
+              <w:right w:type="dxa" w:w="100"/>
+            </w:tcMar>
+          </w:tcPr>
+          <w:p>
+            <w:r>
+              <w:rPr>
+                <w:b/>
+                <w:bCs/>
+              </w:rPr>
+              <w:t xml:space="preserve">8. Dengue monitor</w:t>
+            </w:r>
+          </w:p>
+        </w:tc>
+        <w:tc>
+          <w:tcPr>
+            <w:tcW w:type="dxa" w:w="1150"/>
+            <w:tcBorders>
+              <w:top w:val="single" w:color="BFBFBF" w:sz="4"/>
+              <w:left w:val="single" w:color="BFBFBF" w:sz="4"/>
+              <w:bottom w:val="single" w:color="BFBFBF" w:sz="4"/>
+              <w:right w:val="single" w:color="BFBFBF" w:sz="4"/>
+            </w:tcBorders>
+            <w:tcMar>
+              <w:top w:type="dxa" w:w="60"/>
+              <w:left w:type="dxa" w:w="100"/>
+              <w:bottom w:type="dxa" w:w="60"/>
+              <w:right w:type="dxa" w:w="100"/>
+            </w:tcMar>
+          </w:tcPr>
+          <w:p>
+            <w:pPr>
+              <w:jc w:val="center"/>
+            </w:pPr>
+            <w:r>
+              <w:t xml:space="preserve">High</w:t>
+            </w:r>
+          </w:p>
+        </w:tc>
+        <w:tc>
+          <w:tcPr>
+            <w:tcW w:type="dxa" w:w="1150"/>
+            <w:tcBorders>
+              <w:top w:val="single" w:color="BFBFBF" w:sz="4"/>
+              <w:left w:val="single" w:color="BFBFBF" w:sz="4"/>
+              <w:bottom w:val="single" w:color="BFBFBF" w:sz="4"/>
+              <w:right w:val="single" w:color="BFBFBF" w:sz="4"/>
+            </w:tcBorders>
+            <w:tcMar>
+              <w:top w:type="dxa" w:w="60"/>
+              <w:left w:type="dxa" w:w="100"/>
+              <w:bottom w:type="dxa" w:w="60"/>
+              <w:right w:type="dxa" w:w="100"/>
+            </w:tcMar>
+          </w:tcPr>
+          <w:p>
+            <w:pPr>
+              <w:jc w:val="center"/>
+            </w:pPr>
+            <w:r>
+              <w:t xml:space="preserve">Medium</w:t>
+            </w:r>
+          </w:p>
+        </w:tc>
+        <w:tc>
+          <w:tcPr>
+            <w:tcW w:type="dxa" w:w="1150"/>
+            <w:tcBorders>
+              <w:top w:val="single" w:color="BFBFBF" w:sz="4"/>
+              <w:left w:val="single" w:color="BFBFBF" w:sz="4"/>
+              <w:bottom w:val="single" w:color="BFBFBF" w:sz="4"/>
+              <w:right w:val="single" w:color="BFBFBF" w:sz="4"/>
+            </w:tcBorders>
+            <w:tcMar>
+              <w:top w:type="dxa" w:w="60"/>
+              <w:left w:type="dxa" w:w="100"/>
+              <w:bottom w:type="dxa" w:w="60"/>
+              <w:right w:type="dxa" w:w="100"/>
+            </w:tcMar>
+          </w:tcPr>
+          <w:p>
+            <w:pPr>
+              <w:jc w:val="center"/>
+            </w:pPr>
+            <w:r>
+              <w:t xml:space="preserve">Medium</w:t>
+            </w:r>
+          </w:p>
+        </w:tc>
+        <w:tc>
+          <w:tcPr>
+            <w:tcW w:type="dxa" w:w="1150"/>
+            <w:tcBorders>
+              <w:top w:val="single" w:color="BFBFBF" w:sz="4"/>
+              <w:left w:val="single" w:color="BFBFBF" w:sz="4"/>
+              <w:bottom w:val="single" w:color="BFBFBF" w:sz="4"/>
+              <w:right w:val="single" w:color="BFBFBF" w:sz="4"/>
+            </w:tcBorders>
+            <w:tcMar>
+              <w:top w:type="dxa" w:w="60"/>
+              <w:left w:type="dxa" w:w="100"/>
+              <w:bottom w:type="dxa" w:w="60"/>
+              <w:right w:type="dxa" w:w="100"/>
+            </w:tcMar>
+          </w:tcPr>
+          <w:p>
+            <w:pPr>
+              <w:jc w:val="center"/>
+            </w:pPr>
+            <w:r>
+              <w:t xml:space="preserve">Low</w:t>
+            </w:r>
+          </w:p>
+        </w:tc>
+        <w:tc>
+          <w:tcPr>
+            <w:tcW w:type="dxa" w:w="1150"/>
+            <w:tcBorders>
+              <w:top w:val="single" w:color="BFBFBF" w:sz="4"/>
+              <w:left w:val="single" w:color="BFBFBF" w:sz="4"/>
+              <w:bottom w:val="single" w:color="BFBFBF" w:sz="4"/>
+              <w:right w:val="single" w:color="BFBFBF" w:sz="4"/>
+            </w:tcBorders>
+            <w:tcMar>
+              <w:top w:type="dxa" w:w="60"/>
+              <w:left w:type="dxa" w:w="100"/>
+              <w:bottom w:type="dxa" w:w="60"/>
+              <w:right w:type="dxa" w:w="100"/>
+            </w:tcMar>
+          </w:tcPr>
+          <w:p>
+            <w:pPr>
+              <w:jc w:val="center"/>
+            </w:pPr>
+            <w:r>
+              <w:t xml:space="preserve">Slow</w:t>
+            </w:r>
+          </w:p>
+        </w:tc>
+        <w:tc>
+          <w:tcPr>
+            <w:tcW w:type="dxa" w:w="1150"/>
+            <w:tcBorders>
+              <w:top w:val="single" w:color="BFBFBF" w:sz="4"/>
+              <w:left w:val="single" w:color="BFBFBF" w:sz="4"/>
+              <w:bottom w:val="single" w:color="BFBFBF" w:sz="4"/>
+              <w:right w:val="single" w:color="BFBFBF" w:sz="4"/>
+            </w:tcBorders>
+            <w:tcMar>
+              <w:top w:type="dxa" w:w="60"/>
+              <w:left w:type="dxa" w:w="100"/>
+              <w:bottom w:type="dxa" w:w="60"/>
+              <w:right w:type="dxa" w:w="100"/>
+            </w:tcMar>
+          </w:tcPr>
+          <w:p>
+            <w:pPr>
+              <w:jc w:val="center"/>
+            </w:pPr>
+            <w:r>
+              <w:t xml:space="preserve">Good</w:t>
+            </w:r>
+          </w:p>
+        </w:tc>
+      </w:tr>
+      <w:tr>
+        <w:trPr>
+          <w:cantSplit/>
+        </w:trPr>
+        <w:tc>
+          <w:tcPr>
+            <w:tcW w:type="dxa" w:w="2126"/>
+            <w:tcBorders>
+              <w:top w:val="single" w:color="BFBFBF" w:sz="4"/>
+              <w:left w:val="single" w:color="BFBFBF" w:sz="4"/>
+              <w:bottom w:val="single" w:color="BFBFBF" w:sz="4"/>
+              <w:right w:val="single" w:color="BFBFBF" w:sz="4"/>
+            </w:tcBorders>
+            <w:shd w:fill="F2F2F2" w:color="auto" w:val="clear"/>
+            <w:tcMar>
+              <w:top w:type="dxa" w:w="60"/>
+              <w:left w:type="dxa" w:w="100"/>
+              <w:bottom w:type="dxa" w:w="60"/>
+              <w:right w:type="dxa" w:w="100"/>
+            </w:tcMar>
+          </w:tcPr>
+          <w:p>
+            <w:r>
+              <w:rPr>
+                <w:b/>
+                <w:bCs/>
+              </w:rPr>
+              <w:t xml:space="preserve">9. Seat monitor</w:t>
+            </w:r>
+          </w:p>
+        </w:tc>
+        <w:tc>
+          <w:tcPr>
+            <w:tcW w:type="dxa" w:w="1150"/>
+            <w:tcBorders>
+              <w:top w:val="single" w:color="BFBFBF" w:sz="4"/>
+              <w:left w:val="single" w:color="BFBFBF" w:sz="4"/>
+              <w:bottom w:val="single" w:color="BFBFBF" w:sz="4"/>
+              <w:right w:val="single" w:color="BFBFBF" w:sz="4"/>
+            </w:tcBorders>
+            <w:tcMar>
+              <w:top w:type="dxa" w:w="60"/>
+              <w:left w:type="dxa" w:w="100"/>
+              <w:bottom w:type="dxa" w:w="60"/>
+              <w:right w:type="dxa" w:w="100"/>
+            </w:tcMar>
+          </w:tcPr>
+          <w:p>
+            <w:pPr>
+              <w:jc w:val="center"/>
+            </w:pPr>
+            <w:r>
+              <w:t xml:space="preserve">Medium</w:t>
+            </w:r>
+          </w:p>
+        </w:tc>
+        <w:tc>
+          <w:tcPr>
+            <w:tcW w:type="dxa" w:w="1150"/>
+            <w:tcBorders>
+              <w:top w:val="single" w:color="BFBFBF" w:sz="4"/>
+              <w:left w:val="single" w:color="BFBFBF" w:sz="4"/>
+              <w:bottom w:val="single" w:color="BFBFBF" w:sz="4"/>
+              <w:right w:val="single" w:color="BFBFBF" w:sz="4"/>
+            </w:tcBorders>
+            <w:tcMar>
+              <w:top w:type="dxa" w:w="60"/>
+              <w:left w:type="dxa" w:w="100"/>
+              <w:bottom w:type="dxa" w:w="60"/>
+              <w:right w:type="dxa" w:w="100"/>
+            </w:tcMar>
+          </w:tcPr>
+          <w:p>
+            <w:pPr>
+              <w:jc w:val="center"/>
+            </w:pPr>
+            <w:r>
+              <w:t xml:space="preserve">Medium</w:t>
+            </w:r>
+          </w:p>
+        </w:tc>
+        <w:tc>
+          <w:tcPr>
+            <w:tcW w:type="dxa" w:w="1150"/>
+            <w:tcBorders>
+              <w:top w:val="single" w:color="BFBFBF" w:sz="4"/>
+              <w:left w:val="single" w:color="BFBFBF" w:sz="4"/>
+              <w:bottom w:val="single" w:color="BFBFBF" w:sz="4"/>
+              <w:right w:val="single" w:color="BFBFBF" w:sz="4"/>
+            </w:tcBorders>
+            <w:tcMar>
+              <w:top w:type="dxa" w:w="60"/>
+              <w:left w:type="dxa" w:w="100"/>
+              <w:bottom w:type="dxa" w:w="60"/>
+              <w:right w:type="dxa" w:w="100"/>
+            </w:tcMar>
+          </w:tcPr>
+          <w:p>
+            <w:pPr>
+              <w:jc w:val="center"/>
+            </w:pPr>
+            <w:r>
+              <w:t xml:space="preserve">Low</w:t>
+            </w:r>
+          </w:p>
+        </w:tc>
+        <w:tc>
+          <w:tcPr>
+            <w:tcW w:type="dxa" w:w="1150"/>
+            <w:tcBorders>
+              <w:top w:val="single" w:color="BFBFBF" w:sz="4"/>
+              <w:left w:val="single" w:color="BFBFBF" w:sz="4"/>
+              <w:bottom w:val="single" w:color="BFBFBF" w:sz="4"/>
+              <w:right w:val="single" w:color="BFBFBF" w:sz="4"/>
+            </w:tcBorders>
+            <w:tcMar>
+              <w:top w:type="dxa" w:w="60"/>
+              <w:left w:type="dxa" w:w="100"/>
+              <w:bottom w:type="dxa" w:w="60"/>
+              <w:right w:type="dxa" w:w="100"/>
+            </w:tcMar>
+          </w:tcPr>
+          <w:p>
+            <w:pPr>
+              <w:jc w:val="center"/>
+            </w:pPr>
+            <w:r>
+              <w:t xml:space="preserve">Low</w:t>
+            </w:r>
+          </w:p>
+        </w:tc>
+        <w:tc>
+          <w:tcPr>
+            <w:tcW w:type="dxa" w:w="1150"/>
+            <w:tcBorders>
+              <w:top w:val="single" w:color="BFBFBF" w:sz="4"/>
+              <w:left w:val="single" w:color="BFBFBF" w:sz="4"/>
+              <w:bottom w:val="single" w:color="BFBFBF" w:sz="4"/>
+              <w:right w:val="single" w:color="BFBFBF" w:sz="4"/>
+            </w:tcBorders>
+            <w:tcMar>
+              <w:top w:type="dxa" w:w="60"/>
+              <w:left w:type="dxa" w:w="100"/>
+              <w:bottom w:type="dxa" w:w="60"/>
+              <w:right w:type="dxa" w:w="100"/>
+            </w:tcMar>
+          </w:tcPr>
+          <w:p>
+            <w:pPr>
+              <w:jc w:val="center"/>
+            </w:pPr>
+            <w:r>
+              <w:t xml:space="preserve">Medium</w:t>
+            </w:r>
+          </w:p>
+        </w:tc>
+        <w:tc>
+          <w:tcPr>
+            <w:tcW w:type="dxa" w:w="1150"/>
+            <w:tcBorders>
+              <w:top w:val="single" w:color="BFBFBF" w:sz="4"/>
+              <w:left w:val="single" w:color="BFBFBF" w:sz="4"/>
+              <w:bottom w:val="single" w:color="BFBFBF" w:sz="4"/>
+              <w:right w:val="single" w:color="BFBFBF" w:sz="4"/>
+            </w:tcBorders>
+            <w:tcMar>
+              <w:top w:type="dxa" w:w="60"/>
+              <w:left w:type="dxa" w:w="100"/>
+              <w:bottom w:type="dxa" w:w="60"/>
+              <w:right w:type="dxa" w:w="100"/>
+            </w:tcMar>
+          </w:tcPr>
+          <w:p>
+            <w:pPr>
+              <w:jc w:val="center"/>
+            </w:pPr>
+            <w:r>
+              <w:t xml:space="preserve">Good</w:t>
+            </w:r>
+          </w:p>
+        </w:tc>
+      </w:tr>
     </w:tbl>
     <w:p>
       <w:pPr>
         <w:pStyle w:val="Heading2"/>
-      </w:pPr>
-      <w:r>
-        <w:t xml:space="preserve">Possible merge</w:t>
-      </w:r>
-    </w:p>
-    <w:p>
-      <w:pPr>
-        <w:spacing w:after="100"/>
-      </w:pPr>
-      <w:r>
-        <w:t xml:space="preserve">Ideas 2 and 4 fit together well: the AI sorting bin (edge: camera classification + funnel sorting) plus fill-level/odour sensing and multi-bin MQTT routing (cloud: fill forecasting and collection-route suggestions). That covers both the real-time edge action and the long-term cloud ML that the brief asks for.</w:t>
-      </w:r>
-    </w:p>
-    <w:p>
-      <w:pPr>
-        <w:pStyle w:val="Heading1"/>
-      </w:pPr>
-      <w:r>
-        <w:t xml:space="preserve">4. Next steps</w:t>
+        <w:keepNext/>
+      </w:pPr>
+      <w:r>
+        <w:t xml:space="preserve">Recommendation (for discussion)</w:t>
       </w:r>
     </w:p>
     <w:p>
@@ -5419,14 +7822,99 @@
         <w:spacing w:after="60"/>
       </w:pPr>
       <w:r>
-        <w:t xml:space="preserve">Everyone: vote for your top 2 ideas in the group chat by </w:t>
-      </w:r>
-      <w:r>
         <w:rPr>
           <w:b/>
           <w:bCs/>
         </w:rPr>
-        <w:t xml:space="preserve">Saturday 26 Sep</w:t>
+        <w:t xml:space="preserve">Highest ceiling: Idea 4 + Idea 2 merged.</w:t>
+      </w:r>
+      <w:r>
+        <w:t xml:space="preserve"> Camera classification and sorting at the edge, with fill-level and waste-mix forecasting across bins in the cloud (this also fixes idea 4's missing cloud ML). To reduce mechanical risk, use a simple servo trapdoor into 2–3 compartments instead of the stepper funnel, and keep the robot arm as a stretch goal.</w:t>
+      </w:r>
+    </w:p>
+    <w:p>
+      <w:pPr>
+        <w:pStyle w:val="ListParagraph"/>
+        <w:numPr>
+          <w:ilvl w:val="0"/>
+          <w:numId w:val="2"/>
+        </w:numPr>
+        <w:spacing w:after="60"/>
+      </w:pPr>
+      <w:r>
+        <w:rPr>
+          <w:b/>
+          <w:bCs/>
+        </w:rPr>
+        <w:t xml:space="preserve">Best balance of risk and marks: Idea 7 (predictive maintenance).</w:t>
+      </w:r>
+      <w:r>
+        <w:t xml:space="preserve"> Cheap, easy to collect lots of data, maps directly to lecture content (autoencoders, Industrial IoT), and the coin-on-fan-blade demo is simple and reliable.</w:t>
+      </w:r>
+    </w:p>
+    <w:p>
+      <w:pPr>
+        <w:pStyle w:val="ListParagraph"/>
+        <w:numPr>
+          <w:ilvl w:val="0"/>
+          <w:numId w:val="2"/>
+        </w:numPr>
+        <w:spacing w:after="60"/>
+      </w:pPr>
+      <w:r>
+        <w:rPr>
+          <w:b/>
+          <w:bCs/>
+        </w:rPr>
+        <w:t xml:space="preserve">Safe option: Idea 1 with a Singapore angle.</w:t>
+      </w:r>
+      <w:r>
+        <w:t xml:space="preserve"> Sudden afternoon storms and HDB laundry poles; the cloud model can add NEA weather data to our own sensor data.</w:t>
+      </w:r>
+    </w:p>
+    <w:p>
+      <w:pPr>
+        <w:pStyle w:val="Heading2"/>
+        <w:keepNext/>
+      </w:pPr>
+      <w:r>
+        <w:t xml:space="preserve">Possible merge</w:t>
+      </w:r>
+    </w:p>
+    <w:p>
+      <w:pPr>
+        <w:spacing w:after="100"/>
+      </w:pPr>
+      <w:r>
+        <w:t xml:space="preserve">Ideas 2 and 4 fit together well: the AI sorting bin (edge: camera classification + funnel sorting) plus fill-level/odour sensing and multi-bin MQTT routing (cloud: fill forecasting and collection-route suggestions). That covers both the real-time edge action and the long-term cloud ML that the brief asks for.</w:t>
+      </w:r>
+    </w:p>
+    <w:p>
+      <w:pPr>
+        <w:pStyle w:val="Heading1"/>
+      </w:pPr>
+      <w:r>
+        <w:t xml:space="preserve">4. Next steps</w:t>
+      </w:r>
+    </w:p>
+    <w:p>
+      <w:pPr>
+        <w:pStyle w:val="ListParagraph"/>
+        <w:numPr>
+          <w:ilvl w:val="0"/>
+          <w:numId w:val="2"/>
+        </w:numPr>
+        <w:spacing w:after="60"/>
+      </w:pPr>
+      <w:r>
+        <w:t xml:space="preserve">Everyone: vote for your top 2 ideas in the group chat by </w:t>
+      </w:r>
+      <w:r>
+        <w:rPr>
+          <w:b/>
+          <w:bCs/>
+        </w:rPr>
+        <w:t xml:space="preserve">Sunday 27 Sep</w:t>
       </w:r>
       <w:r>
         <w:t xml:space="preserve">.</w:t>

</xml_diff>